<commit_message>
Parameter and Values are implemented
</commit_message>
<xml_diff>
--- a/CahierDesCharges.docx
+++ b/CahierDesCharges.docx
@@ -1,6 +1,6 @@
 
 <file path=word/document.xml><?xml version="1.0" encoding="utf-8"?>
-<w:document xmlns:wpc="http://schemas.microsoft.com/office/word/2010/wordprocessingCanvas" xmlns:cx="http://schemas.microsoft.com/office/drawing/2014/chartex" xmlns:cx1="http://schemas.microsoft.com/office/drawing/2015/9/8/chartex" xmlns:cx2="http://schemas.microsoft.com/office/drawing/2015/10/21/chartex" xmlns:cx3="http://schemas.microsoft.com/office/drawing/2016/5/9/chartex" xmlns:cx4="http://schemas.microsoft.com/office/drawing/2016/5/10/chartex" xmlns:cx5="http://schemas.microsoft.com/office/drawing/2016/5/11/chartex" xmlns:cx6="http://schemas.microsoft.com/office/drawing/2016/5/12/chartex" xmlns:cx7="http://schemas.microsoft.com/office/drawing/2016/5/13/chartex" xmlns:cx8="http://schemas.microsoft.com/office/drawing/2016/5/14/chartex" xmlns:mc="http://schemas.openxmlformats.org/markup-compatibility/2006" xmlns:aink="http://schemas.microsoft.com/office/drawing/2016/ink" xmlns:am3d="http://schemas.microsoft.com/office/drawing/2017/model3d" xmlns:o="urn:schemas-microsoft-com:office:office" xmlns:oel="http://schemas.microsoft.com/office/2019/extlst" xmlns:r="http://schemas.openxmlformats.org/officeDocument/2006/relationships" xmlns:m="http://schemas.openxmlformats.org/officeDocument/2006/math" xmlns:v="urn:schemas-microsoft-com:vml" xmlns:wp14="http://schemas.microsoft.com/office/word/2010/wordprocessingDrawing" xmlns:wp="http://schemas.openxmlformats.org/drawingml/2006/wordprocessingDrawing" xmlns:w10="urn:schemas-microsoft-com:office:word" xmlns:w="http://schemas.openxmlformats.org/wordprocessingml/2006/main" xmlns:w14="http://schemas.microsoft.com/office/word/2010/wordml" xmlns:w15="http://schemas.microsoft.com/office/word/2012/wordml" xmlns:w16cex="http://schemas.microsoft.com/office/word/2018/wordml/cex" xmlns:w16cid="http://schemas.microsoft.com/office/word/2016/wordml/cid" xmlns:w16="http://schemas.microsoft.com/office/word/2018/wordml" xmlns:w16du="http://schemas.microsoft.com/office/word/2023/wordml/word16du" xmlns:w16sdtdh="http://schemas.microsoft.com/office/word/2020/wordml/sdtdatahash" xmlns:w16sdtfl="http://schemas.microsoft.com/office/word/2024/wordml/sdtformatlock" xmlns:w16se="http://schemas.microsoft.com/office/word/2015/wordml/symex" xmlns:wpg="http://schemas.microsoft.com/office/word/2010/wordprocessingGroup" xmlns:wpi="http://schemas.microsoft.com/office/word/2010/wordprocessingInk" xmlns:wne="http://schemas.microsoft.com/office/word/2006/wordml" xmlns:wps="http://schemas.microsoft.com/office/word/2010/wordprocessingShape" mc:Ignorable="w14 w15 w16se w16cid w16 w16cex w16sdtdh w16sdtfl w16du wp14">
+<w:document xmlns:wpc="http://schemas.microsoft.com/office/word/2010/wordprocessingCanvas" xmlns:cx="http://schemas.microsoft.com/office/drawing/2014/chartex" xmlns:cx1="http://schemas.microsoft.com/office/drawing/2015/9/8/chartex" xmlns:cx2="http://schemas.microsoft.com/office/drawing/2015/10/21/chartex" xmlns:cx3="http://schemas.microsoft.com/office/drawing/2016/5/9/chartex" xmlns:cx4="http://schemas.microsoft.com/office/drawing/2016/5/10/chartex" xmlns:cx5="http://schemas.microsoft.com/office/drawing/2016/5/11/chartex" xmlns:cx6="http://schemas.microsoft.com/office/drawing/2016/5/12/chartex" xmlns:cx7="http://schemas.microsoft.com/office/drawing/2016/5/13/chartex" xmlns:cx8="http://schemas.microsoft.com/office/drawing/2016/5/14/chartex" xmlns:mc="http://schemas.openxmlformats.org/markup-compatibility/2006" xmlns:aink="http://schemas.microsoft.com/office/drawing/2016/ink" xmlns:am3d="http://schemas.microsoft.com/office/drawing/2017/model3d" xmlns:o="urn:schemas-microsoft-com:office:office" xmlns:oel="http://schemas.microsoft.com/office/2019/extlst" xmlns:r="http://schemas.openxmlformats.org/officeDocument/2006/relationships" xmlns:m="http://schemas.openxmlformats.org/officeDocument/2006/math" xmlns:v="urn:schemas-microsoft-com:vml" xmlns:wp14="http://schemas.microsoft.com/office/word/2010/wordprocessingDrawing" xmlns:wp="http://schemas.openxmlformats.org/drawingml/2006/wordprocessingDrawing" xmlns:w10="urn:schemas-microsoft-com:office:word" xmlns:w="http://schemas.openxmlformats.org/wordprocessingml/2006/main" xmlns:w14="http://schemas.microsoft.com/office/word/2010/wordml" xmlns:w15="http://schemas.microsoft.com/office/word/2012/wordml" xmlns:w16cei="http://schemas.microsoft.com/office/word/2026/wordml/cei" xmlns:w16cex="http://schemas.microsoft.com/office/word/2018/wordml/cex" xmlns:w16cid="http://schemas.microsoft.com/office/word/2016/wordml/cid" xmlns:w16="http://schemas.microsoft.com/office/word/2018/wordml" xmlns:w16du="http://schemas.microsoft.com/office/word/2023/wordml/word16du" xmlns:w16sdtdh="http://schemas.microsoft.com/office/word/2020/wordml/sdtdatahash" xmlns:w16sdtfl="http://schemas.microsoft.com/office/word/2024/wordml/sdtformatlock" xmlns:w16se="http://schemas.microsoft.com/office/word/2015/wordml/symex" xmlns:wpg="http://schemas.microsoft.com/office/word/2010/wordprocessingGroup" xmlns:wpi="http://schemas.microsoft.com/office/word/2010/wordprocessingInk" xmlns:wne="http://schemas.microsoft.com/office/word/2006/wordml" xmlns:wps="http://schemas.microsoft.com/office/word/2010/wordprocessingShape" mc:Ignorable="w14 w15 w16se w16cid w16 w16cex w16sdtdh w16sdtfl w16du wp14">
   <w:body>
     <w:p>
       <w:pPr>
@@ -14,17 +14,8 @@
           <w:b/>
           <w:bCs/>
         </w:rPr>
-        <w:t xml:space="preserve">Laws </w:t>
-      </w:r>
-      <w:proofErr w:type="spellStart"/>
-      <w:r>
-        <w:rPr>
-          <w:b/>
-          <w:bCs/>
-        </w:rPr>
-        <w:t>Laboratory</w:t>
-      </w:r>
-      <w:proofErr w:type="spellEnd"/>
+        <w:t>Laws Laboratory</w:t>
+      </w:r>
     </w:p>
     <w:p>
       <w:pPr>
@@ -44,7 +35,7 @@
     <w:p>
       <w:r>
         <w:pict w14:anchorId="4374DF17">
-          <v:rect id="_x0000_i1848" style="width:0;height:1.5pt" o:hralign="center" o:hrstd="t" o:hr="t" fillcolor="#a0a0a0" stroked="f"/>
+          <v:rect id="_x0000_i1025" style="width:0;height:1.5pt" o:hralign="center" o:hrstd="t" o:hr="t" fillcolor="#a0a0a0" stroked="f"/>
         </w:pict>
       </w:r>
     </w:p>
@@ -65,15 +56,7 @@
     </w:p>
     <w:p>
       <w:r>
-        <w:t xml:space="preserve">Laws </w:t>
-      </w:r>
-      <w:proofErr w:type="spellStart"/>
-      <w:r>
-        <w:t>Laboratory</w:t>
-      </w:r>
-      <w:proofErr w:type="spellEnd"/>
-      <w:r>
-        <w:t xml:space="preserve"> est une plateforme de simulation permettant de créer, configurer et exécuter des modèles reposant sur l'application de lois mathématiques à un ensemble de cellules.</w:t>
+        <w:t>Laws Laboratory est une plateforme de simulation permettant de créer, configurer et exécuter des modèles reposant sur l'application de lois mathématiques à un ensemble de cellules.</w:t>
       </w:r>
     </w:p>
     <w:p>
@@ -88,13 +71,8 @@
           <w:numId w:val="1"/>
         </w:numPr>
       </w:pPr>
-      <w:proofErr w:type="gramStart"/>
-      <w:r>
-        <w:t>les</w:t>
-      </w:r>
-      <w:proofErr w:type="gramEnd"/>
-      <w:r>
-        <w:t xml:space="preserve"> paramètres manipulés ;</w:t>
+      <w:r>
+        <w:t>les paramètres manipulés ;</w:t>
       </w:r>
     </w:p>
     <w:p>
@@ -104,13 +82,8 @@
           <w:numId w:val="1"/>
         </w:numPr>
       </w:pPr>
-      <w:proofErr w:type="gramStart"/>
-      <w:r>
-        <w:t>les</w:t>
-      </w:r>
-      <w:proofErr w:type="gramEnd"/>
-      <w:r>
-        <w:t xml:space="preserve"> lois d'évolution ;</w:t>
+      <w:r>
+        <w:t>les lois d'évolution ;</w:t>
       </w:r>
     </w:p>
     <w:p>
@@ -120,13 +93,8 @@
           <w:numId w:val="1"/>
         </w:numPr>
       </w:pPr>
-      <w:proofErr w:type="gramStart"/>
-      <w:r>
-        <w:t>les</w:t>
-      </w:r>
-      <w:proofErr w:type="gramEnd"/>
-      <w:r>
-        <w:t xml:space="preserve"> règles de transmission ;</w:t>
+      <w:r>
+        <w:t>les règles de transmission ;</w:t>
       </w:r>
     </w:p>
     <w:p>
@@ -136,13 +104,8 @@
           <w:numId w:val="1"/>
         </w:numPr>
       </w:pPr>
-      <w:proofErr w:type="gramStart"/>
-      <w:r>
-        <w:t>les</w:t>
-      </w:r>
-      <w:proofErr w:type="gramEnd"/>
-      <w:r>
-        <w:t xml:space="preserve"> règles d'initialisation ;</w:t>
+      <w:r>
+        <w:t>les règles d'initialisation ;</w:t>
       </w:r>
     </w:p>
     <w:p>
@@ -152,13 +115,8 @@
           <w:numId w:val="1"/>
         </w:numPr>
       </w:pPr>
-      <w:proofErr w:type="gramStart"/>
-      <w:r>
-        <w:t>les</w:t>
-      </w:r>
-      <w:proofErr w:type="gramEnd"/>
-      <w:r>
-        <w:t xml:space="preserve"> métriques ;</w:t>
+      <w:r>
+        <w:t>les métriques ;</w:t>
       </w:r>
     </w:p>
     <w:p>
@@ -168,13 +126,8 @@
           <w:numId w:val="1"/>
         </w:numPr>
       </w:pPr>
-      <w:proofErr w:type="gramStart"/>
-      <w:r>
-        <w:t>les</w:t>
-      </w:r>
-      <w:proofErr w:type="gramEnd"/>
-      <w:r>
-        <w:t xml:space="preserve"> moteurs de calcul.</w:t>
+      <w:r>
+        <w:t>les moteurs de calcul.</w:t>
       </w:r>
     </w:p>
     <w:p>
@@ -190,7 +143,7 @@
     <w:p>
       <w:r>
         <w:pict w14:anchorId="759F5B1B">
-          <v:rect id="_x0000_i1849" style="width:0;height:1.5pt" o:hralign="center" o:hrstd="t" o:hr="t" fillcolor="#a0a0a0" stroked="f"/>
+          <v:rect id="_x0000_i1026" style="width:0;height:1.5pt" o:hralign="center" o:hrstd="t" o:hr="t" fillcolor="#a0a0a0" stroked="f"/>
         </w:pict>
       </w:r>
     </w:p>
@@ -241,13 +194,8 @@
           <w:numId w:val="2"/>
         </w:numPr>
       </w:pPr>
-      <w:proofErr w:type="gramStart"/>
-      <w:r>
-        <w:t>simulations</w:t>
-      </w:r>
-      <w:proofErr w:type="gramEnd"/>
-      <w:r>
-        <w:t xml:space="preserve"> ;</w:t>
+      <w:r>
+        <w:t>simulations ;</w:t>
       </w:r>
     </w:p>
     <w:p>
@@ -257,13 +205,8 @@
           <w:numId w:val="2"/>
         </w:numPr>
       </w:pPr>
-      <w:proofErr w:type="gramStart"/>
-      <w:r>
-        <w:t>paramètres</w:t>
-      </w:r>
-      <w:proofErr w:type="gramEnd"/>
-      <w:r>
-        <w:t xml:space="preserve"> ;</w:t>
+      <w:r>
+        <w:t>paramètres ;</w:t>
       </w:r>
     </w:p>
     <w:p>
@@ -273,13 +216,8 @@
           <w:numId w:val="2"/>
         </w:numPr>
       </w:pPr>
-      <w:proofErr w:type="gramStart"/>
-      <w:r>
-        <w:t>lois</w:t>
-      </w:r>
-      <w:proofErr w:type="gramEnd"/>
-      <w:r>
-        <w:t xml:space="preserve"> ;</w:t>
+      <w:r>
+        <w:t>lois ;</w:t>
       </w:r>
     </w:p>
     <w:p>
@@ -289,13 +227,8 @@
           <w:numId w:val="2"/>
         </w:numPr>
       </w:pPr>
-      <w:proofErr w:type="gramStart"/>
-      <w:r>
-        <w:t>formules</w:t>
-      </w:r>
-      <w:proofErr w:type="gramEnd"/>
-      <w:r>
-        <w:t xml:space="preserve"> ;</w:t>
+      <w:r>
+        <w:t>formules ;</w:t>
       </w:r>
     </w:p>
     <w:p>
@@ -305,14 +238,9 @@
           <w:numId w:val="2"/>
         </w:numPr>
       </w:pPr>
-      <w:proofErr w:type="gramStart"/>
       <w:r>
         <w:lastRenderedPageBreak/>
-        <w:t>métriques</w:t>
-      </w:r>
-      <w:proofErr w:type="gramEnd"/>
-      <w:r>
-        <w:t xml:space="preserve"> ;</w:t>
+        <w:t>métriques ;</w:t>
       </w:r>
     </w:p>
     <w:p>
@@ -322,13 +250,8 @@
           <w:numId w:val="2"/>
         </w:numPr>
       </w:pPr>
-      <w:proofErr w:type="gramStart"/>
-      <w:r>
-        <w:t>configurations</w:t>
-      </w:r>
-      <w:proofErr w:type="gramEnd"/>
-      <w:r>
-        <w:t xml:space="preserve"> ;</w:t>
+      <w:r>
+        <w:t>configurations ;</w:t>
       </w:r>
     </w:p>
     <w:p>
@@ -338,13 +261,8 @@
           <w:numId w:val="2"/>
         </w:numPr>
       </w:pPr>
-      <w:proofErr w:type="gramStart"/>
-      <w:r>
-        <w:t>utilisateurs</w:t>
-      </w:r>
-      <w:proofErr w:type="gramEnd"/>
-      <w:r>
-        <w:t xml:space="preserve"> ;</w:t>
+      <w:r>
+        <w:t>utilisateurs ;</w:t>
       </w:r>
     </w:p>
     <w:p>
@@ -354,13 +272,8 @@
           <w:numId w:val="2"/>
         </w:numPr>
       </w:pPr>
-      <w:proofErr w:type="gramStart"/>
-      <w:r>
-        <w:t>sauvegardes</w:t>
-      </w:r>
-      <w:proofErr w:type="gramEnd"/>
-      <w:r>
-        <w:t>.</w:t>
+      <w:r>
+        <w:t>sauvegardes.</w:t>
       </w:r>
     </w:p>
     <w:p>
@@ -371,7 +284,7 @@
     <w:p>
       <w:r>
         <w:pict w14:anchorId="7D770E45">
-          <v:rect id="_x0000_i1850" style="width:0;height:1.5pt" o:hralign="center" o:hrstd="t" o:hr="t" fillcolor="#a0a0a0" stroked="f"/>
+          <v:rect id="_x0000_i1027" style="width:0;height:1.5pt" o:hralign="center" o:hrstd="t" o:hr="t" fillcolor="#a0a0a0" stroked="f"/>
         </w:pict>
       </w:r>
     </w:p>
@@ -407,13 +320,8 @@
           <w:numId w:val="3"/>
         </w:numPr>
       </w:pPr>
-      <w:proofErr w:type="gramStart"/>
-      <w:r>
-        <w:t>un</w:t>
-      </w:r>
-      <w:proofErr w:type="gramEnd"/>
-      <w:r>
-        <w:t xml:space="preserve"> nom ;</w:t>
+      <w:r>
+        <w:t>un nom ;</w:t>
       </w:r>
     </w:p>
     <w:p>
@@ -423,13 +331,8 @@
           <w:numId w:val="3"/>
         </w:numPr>
       </w:pPr>
-      <w:proofErr w:type="gramStart"/>
-      <w:r>
-        <w:t>un</w:t>
-      </w:r>
-      <w:proofErr w:type="gramEnd"/>
-      <w:r>
-        <w:t xml:space="preserve"> type ;</w:t>
+      <w:r>
+        <w:t>un type ;</w:t>
       </w:r>
     </w:p>
     <w:p>
@@ -439,13 +342,8 @@
           <w:numId w:val="3"/>
         </w:numPr>
       </w:pPr>
-      <w:proofErr w:type="gramStart"/>
-      <w:r>
-        <w:t>un</w:t>
-      </w:r>
-      <w:proofErr w:type="gramEnd"/>
-      <w:r>
-        <w:t xml:space="preserve"> domaine de valeurs admissibles ;</w:t>
+      <w:r>
+        <w:t>un domaine de valeurs admissibles ;</w:t>
       </w:r>
     </w:p>
     <w:p>
@@ -455,29 +353,8 @@
           <w:numId w:val="3"/>
         </w:numPr>
       </w:pPr>
-      <w:proofErr w:type="gramStart"/>
-      <w:r>
-        <w:t>un</w:t>
-      </w:r>
-      <w:proofErr w:type="gramEnd"/>
-      <w:r>
-        <w:t xml:space="preserve"> état par défaut « mort » distinct des valeurs possibles ;</w:t>
-      </w:r>
-    </w:p>
-    <w:p>
-      <w:pPr>
-        <w:numPr>
-          <w:ilvl w:val="0"/>
-          <w:numId w:val="3"/>
-        </w:numPr>
-      </w:pPr>
-      <w:proofErr w:type="gramStart"/>
-      <w:r>
-        <w:t>une</w:t>
-      </w:r>
-      <w:proofErr w:type="gramEnd"/>
-      <w:r>
-        <w:t xml:space="preserve"> règle d'initialisation.</w:t>
+      <w:r>
+        <w:t>un état par défaut « mort » distinct des valeurs possibles ;</w:t>
       </w:r>
     </w:p>
     <w:p>
@@ -488,7 +365,7 @@
     <w:p>
       <w:r>
         <w:pict w14:anchorId="5B6B69D2">
-          <v:rect id="_x0000_i1851" style="width:0;height:1.5pt" o:hralign="center" o:hrstd="t" o:hr="t" fillcolor="#a0a0a0" stroked="f"/>
+          <v:rect id="_x0000_i1028" style="width:0;height:1.5pt" o:hralign="center" o:hrstd="t" o:hr="t" fillcolor="#a0a0a0" stroked="f"/>
         </w:pict>
       </w:r>
     </w:p>
@@ -524,13 +401,8 @@
           <w:numId w:val="4"/>
         </w:numPr>
       </w:pPr>
-      <w:proofErr w:type="gramStart"/>
-      <w:r>
-        <w:t>une</w:t>
-      </w:r>
-      <w:proofErr w:type="gramEnd"/>
-      <w:r>
-        <w:t xml:space="preserve"> position ;</w:t>
+      <w:r>
+        <w:t>une position ;</w:t>
       </w:r>
     </w:p>
     <w:p>
@@ -540,13 +412,8 @@
           <w:numId w:val="4"/>
         </w:numPr>
       </w:pPr>
-      <w:proofErr w:type="gramStart"/>
-      <w:r>
-        <w:t>une</w:t>
-      </w:r>
-      <w:proofErr w:type="gramEnd"/>
-      <w:r>
-        <w:t xml:space="preserve"> collection de paramètres.</w:t>
+      <w:r>
+        <w:t>une collection de paramètres.</w:t>
       </w:r>
     </w:p>
     <w:p>
@@ -566,13 +433,8 @@
           <w:numId w:val="5"/>
         </w:numPr>
       </w:pPr>
-      <w:proofErr w:type="gramStart"/>
-      <w:r>
-        <w:t>ni</w:t>
-      </w:r>
-      <w:proofErr w:type="gramEnd"/>
-      <w:r>
-        <w:t xml:space="preserve"> les lois ;</w:t>
+      <w:r>
+        <w:t>ni les lois ;</w:t>
       </w:r>
     </w:p>
     <w:p>
@@ -582,13 +444,8 @@
           <w:numId w:val="5"/>
         </w:numPr>
       </w:pPr>
-      <w:proofErr w:type="gramStart"/>
-      <w:r>
-        <w:t>ni</w:t>
-      </w:r>
-      <w:proofErr w:type="gramEnd"/>
-      <w:r>
-        <w:t xml:space="preserve"> les calculs ;</w:t>
+      <w:r>
+        <w:t>ni les calculs ;</w:t>
       </w:r>
     </w:p>
     <w:p>
@@ -598,30 +455,25 @@
           <w:numId w:val="5"/>
         </w:numPr>
       </w:pPr>
-      <w:proofErr w:type="gramStart"/>
-      <w:r>
-        <w:t>ni</w:t>
-      </w:r>
-      <w:proofErr w:type="gramEnd"/>
-      <w:r>
-        <w:t xml:space="preserve"> son voisinage.</w:t>
+      <w:r>
+        <w:t>ni son voisinage.</w:t>
+      </w:r>
+    </w:p>
+    <w:p>
+      <w:r>
+        <w:t>Toute logique est orchestrée par le simulateur.</w:t>
       </w:r>
     </w:p>
     <w:p>
       <w:r>
         <w:lastRenderedPageBreak/>
-        <w:t>Toute logique est orchestrée par le simulateur.</w:t>
-      </w:r>
-    </w:p>
-    <w:p>
-      <w:r>
         <w:t>Les relations spatiales peuvent être mises en cache après initialisation afin d'éviter les recalculs.</w:t>
       </w:r>
     </w:p>
     <w:p>
       <w:r>
         <w:pict w14:anchorId="42C787C3">
-          <v:rect id="_x0000_i1852" style="width:0;height:1.5pt" o:hralign="center" o:hrstd="t" o:hr="t" fillcolor="#a0a0a0" stroked="f"/>
+          <v:rect id="_x0000_i1029" style="width:0;height:1.5pt" o:hralign="center" o:hrstd="t" o:hr="t" fillcolor="#a0a0a0" stroked="f"/>
         </w:pict>
       </w:r>
     </w:p>
@@ -657,13 +509,8 @@
           <w:numId w:val="6"/>
         </w:numPr>
       </w:pPr>
-      <w:proofErr w:type="gramStart"/>
-      <w:r>
-        <w:t>une</w:t>
-      </w:r>
-      <w:proofErr w:type="gramEnd"/>
-      <w:r>
-        <w:t xml:space="preserve"> dimension ;</w:t>
+      <w:r>
+        <w:t>une dimension ;</w:t>
       </w:r>
     </w:p>
     <w:p>
@@ -673,13 +520,8 @@
           <w:numId w:val="6"/>
         </w:numPr>
       </w:pPr>
-      <w:proofErr w:type="gramStart"/>
-      <w:r>
-        <w:t>un</w:t>
-      </w:r>
-      <w:proofErr w:type="gramEnd"/>
-      <w:r>
-        <w:t xml:space="preserve"> système de coordonnées ;</w:t>
+      <w:r>
+        <w:t>un système de coordonnées ;</w:t>
       </w:r>
     </w:p>
     <w:p>
@@ -689,13 +531,8 @@
           <w:numId w:val="6"/>
         </w:numPr>
       </w:pPr>
-      <w:proofErr w:type="gramStart"/>
-      <w:r>
-        <w:t>une</w:t>
-      </w:r>
-      <w:proofErr w:type="gramEnd"/>
-      <w:r>
-        <w:t xml:space="preserve"> origine ;</w:t>
+      <w:r>
+        <w:t>une origine ;</w:t>
       </w:r>
     </w:p>
     <w:p>
@@ -705,13 +542,8 @@
           <w:numId w:val="6"/>
         </w:numPr>
       </w:pPr>
-      <w:proofErr w:type="gramStart"/>
-      <w:r>
-        <w:t>des</w:t>
-      </w:r>
-      <w:proofErr w:type="gramEnd"/>
-      <w:r>
-        <w:t xml:space="preserve"> règles de voisinage.</w:t>
+      <w:r>
+        <w:t>des règles de voisinage.</w:t>
       </w:r>
     </w:p>
     <w:p>
@@ -731,13 +563,8 @@
           <w:numId w:val="7"/>
         </w:numPr>
       </w:pPr>
-      <w:proofErr w:type="gramStart"/>
-      <w:r>
-        <w:t>des</w:t>
-      </w:r>
-      <w:proofErr w:type="gramEnd"/>
-      <w:r>
-        <w:t xml:space="preserve"> simulations 2D ;</w:t>
+      <w:r>
+        <w:t>des simulations 2D ;</w:t>
       </w:r>
     </w:p>
     <w:p>
@@ -747,13 +574,8 @@
           <w:numId w:val="7"/>
         </w:numPr>
       </w:pPr>
-      <w:proofErr w:type="gramStart"/>
-      <w:r>
-        <w:t>des</w:t>
-      </w:r>
-      <w:proofErr w:type="gramEnd"/>
-      <w:r>
-        <w:t xml:space="preserve"> simulations 3D ;</w:t>
+      <w:r>
+        <w:t>des simulations 3D ;</w:t>
       </w:r>
     </w:p>
     <w:p>
@@ -763,19 +585,14 @@
           <w:numId w:val="7"/>
         </w:numPr>
       </w:pPr>
-      <w:proofErr w:type="gramStart"/>
-      <w:r>
-        <w:t>une</w:t>
-      </w:r>
-      <w:proofErr w:type="gramEnd"/>
-      <w:r>
-        <w:t xml:space="preserve"> évolution possible vers des espaces multidimensionnels.</w:t>
+      <w:r>
+        <w:t>une évolution possible vers des espaces multidimensionnels.</w:t>
       </w:r>
     </w:p>
     <w:p>
       <w:r>
         <w:pict w14:anchorId="7BB021F2">
-          <v:rect id="_x0000_i1853" style="width:0;height:1.5pt" o:hralign="center" o:hrstd="t" o:hr="t" fillcolor="#a0a0a0" stroked="f"/>
+          <v:rect id="_x0000_i1030" style="width:0;height:1.5pt" o:hralign="center" o:hrstd="t" o:hr="t" fillcolor="#a0a0a0" stroked="f"/>
         </w:pict>
       </w:r>
     </w:p>
@@ -812,17 +629,7 @@
         <w:t xml:space="preserve"> </w:t>
       </w:r>
       <w:r>
-        <w:t>(</w:t>
-      </w:r>
-      <w:proofErr w:type="spellStart"/>
-      <w:proofErr w:type="gramStart"/>
-      <w:r>
-        <w:t>x,y</w:t>
-      </w:r>
-      <w:proofErr w:type="spellEnd"/>
-      <w:proofErr w:type="gramEnd"/>
-      <w:r>
-        <w:t>)</w:t>
+        <w:t>(x,y)</w:t>
       </w:r>
     </w:p>
     <w:p>
@@ -833,20 +640,7 @@
         <w:t xml:space="preserve"> </w:t>
       </w:r>
       <w:r>
-        <w:t>(</w:t>
-      </w:r>
-      <w:proofErr w:type="spellStart"/>
-      <w:proofErr w:type="gramStart"/>
-      <w:r>
-        <w:t>x,y</w:t>
-      </w:r>
-      <w:proofErr w:type="gramEnd"/>
-      <w:r>
-        <w:t>,z</w:t>
-      </w:r>
-      <w:proofErr w:type="spellEnd"/>
-      <w:r>
-        <w:t>)</w:t>
+        <w:t>(x,y,z)</w:t>
       </w:r>
     </w:p>
     <w:p>
@@ -857,7 +651,7 @@
     <w:p>
       <w:r>
         <w:pict w14:anchorId="2F134683">
-          <v:rect id="_x0000_i1854" style="width:0;height:1.5pt" o:hralign="center" o:hrstd="t" o:hr="t" fillcolor="#a0a0a0" stroked="f"/>
+          <v:rect id="_x0000_i1031" style="width:0;height:1.5pt" o:hralign="center" o:hrstd="t" o:hr="t" fillcolor="#a0a0a0" stroked="f"/>
         </w:pict>
       </w:r>
     </w:p>
@@ -877,19 +671,25 @@
       </w:r>
     </w:p>
     <w:p>
-      <w:proofErr w:type="gramStart"/>
-      <w:r>
-        <w:t>Une loi décrit</w:t>
-      </w:r>
-      <w:proofErr w:type="gramEnd"/>
-      <w:r>
-        <w:t xml:space="preserve"> l'évolution d'un paramètre.</w:t>
-      </w:r>
-    </w:p>
-    <w:p>
+      <w:r>
+        <w:t>Une loi décrit l'évolution d'un paramètre.</w:t>
+      </w:r>
+    </w:p>
+    <w:p>
+      <w:r>
+        <w:t>Elle contient :</w:t>
+      </w:r>
+    </w:p>
+    <w:p>
+      <w:pPr>
+        <w:numPr>
+          <w:ilvl w:val="0"/>
+          <w:numId w:val="8"/>
+        </w:numPr>
+      </w:pPr>
       <w:r>
         <w:lastRenderedPageBreak/>
-        <w:t>Elle contient :</w:t>
+        <w:t>un paramètre cible ;</w:t>
       </w:r>
     </w:p>
     <w:p>
@@ -899,13 +699,8 @@
           <w:numId w:val="8"/>
         </w:numPr>
       </w:pPr>
-      <w:proofErr w:type="gramStart"/>
-      <w:r>
-        <w:t>un</w:t>
-      </w:r>
-      <w:proofErr w:type="gramEnd"/>
-      <w:r>
-        <w:t xml:space="preserve"> paramètre cible ;</w:t>
+      <w:r>
+        <w:t>une règle de variation ;</w:t>
       </w:r>
     </w:p>
     <w:p>
@@ -915,13 +710,8 @@
           <w:numId w:val="8"/>
         </w:numPr>
       </w:pPr>
-      <w:proofErr w:type="gramStart"/>
-      <w:r>
-        <w:t>une</w:t>
-      </w:r>
-      <w:proofErr w:type="gramEnd"/>
-      <w:r>
-        <w:t xml:space="preserve"> règle de variation ;</w:t>
+      <w:r>
+        <w:t>une règle de transmission ;</w:t>
       </w:r>
     </w:p>
     <w:p>
@@ -931,13 +721,8 @@
           <w:numId w:val="8"/>
         </w:numPr>
       </w:pPr>
-      <w:proofErr w:type="gramStart"/>
-      <w:r>
-        <w:t>une</w:t>
-      </w:r>
-      <w:proofErr w:type="gramEnd"/>
-      <w:r>
-        <w:t xml:space="preserve"> règle de transmission ;</w:t>
+      <w:r>
+        <w:t>une règle d'initialisation ;</w:t>
       </w:r>
     </w:p>
     <w:p>
@@ -947,29 +732,8 @@
           <w:numId w:val="8"/>
         </w:numPr>
       </w:pPr>
-      <w:proofErr w:type="gramStart"/>
-      <w:r>
-        <w:t>une</w:t>
-      </w:r>
-      <w:proofErr w:type="gramEnd"/>
-      <w:r>
-        <w:t xml:space="preserve"> règle d'initialisation ;</w:t>
-      </w:r>
-    </w:p>
-    <w:p>
-      <w:pPr>
-        <w:numPr>
-          <w:ilvl w:val="0"/>
-          <w:numId w:val="8"/>
-        </w:numPr>
-      </w:pPr>
-      <w:proofErr w:type="gramStart"/>
-      <w:r>
-        <w:t>une</w:t>
-      </w:r>
-      <w:proofErr w:type="gramEnd"/>
-      <w:r>
-        <w:t xml:space="preserve"> formule.</w:t>
+      <w:r>
+        <w:t>une formule.</w:t>
       </w:r>
     </w:p>
     <w:p>
@@ -985,7 +749,7 @@
     <w:p>
       <w:r>
         <w:pict w14:anchorId="1184E456">
-          <v:rect id="_x0000_i1855" style="width:0;height:1.5pt" o:hralign="center" o:hrstd="t" o:hr="t" fillcolor="#a0a0a0" stroked="f"/>
+          <v:rect id="_x0000_i1032" style="width:0;height:1.5pt" o:hralign="center" o:hrstd="t" o:hr="t" fillcolor="#a0a0a0" stroked="f"/>
         </w:pict>
       </w:r>
     </w:p>
@@ -1015,23 +779,7 @@
       </w:r>
       <w:r>
         <w:br/>
-        <w:t>U_{n+</w:t>
-      </w:r>
-      <w:proofErr w:type="gramStart"/>
-      <w:r>
-        <w:t>1}=</w:t>
-      </w:r>
-      <w:proofErr w:type="gramEnd"/>
-      <w:r>
-        <w:t>f(</w:t>
-      </w:r>
-      <w:proofErr w:type="spellStart"/>
-      <w:r>
-        <w:t>U_n</w:t>
-      </w:r>
-      <w:proofErr w:type="spellEnd"/>
-      <w:r>
-        <w:t>)</w:t>
+        <w:t>U_{n+1}=f(U_n)</w:t>
       </w:r>
       <w:r>
         <w:br/>
@@ -1046,7 +794,7 @@
     <w:p>
       <w:r>
         <w:pict w14:anchorId="32387B6E">
-          <v:rect id="_x0000_i1856" style="width:0;height:1.5pt" o:hralign="center" o:hrstd="t" o:hr="t" fillcolor="#a0a0a0" stroked="f"/>
+          <v:rect id="_x0000_i1033" style="width:0;height:1.5pt" o:hralign="center" o:hrstd="t" o:hr="t" fillcolor="#a0a0a0" stroked="f"/>
         </w:pict>
       </w:r>
     </w:p>
@@ -1088,31 +836,7 @@
         <w:t xml:space="preserve"> : </w:t>
       </w:r>
       <w:r>
-        <w:t>(-1,0</w:t>
-      </w:r>
-      <w:proofErr w:type="gramStart"/>
-      <w:r>
-        <w:t>),(</w:t>
-      </w:r>
-      <w:proofErr w:type="gramEnd"/>
-      <w:r>
-        <w:t>1,0</w:t>
-      </w:r>
-      <w:proofErr w:type="gramStart"/>
-      <w:r>
-        <w:t>),(</w:t>
-      </w:r>
-      <w:proofErr w:type="gramEnd"/>
-      <w:r>
-        <w:t>0,-1</w:t>
-      </w:r>
-      <w:proofErr w:type="gramStart"/>
-      <w:r>
-        <w:t>),(</w:t>
-      </w:r>
-      <w:proofErr w:type="gramEnd"/>
-      <w:r>
-        <w:t>0,1)</w:t>
+        <w:t>(-1,0),(1,0),(0,-1),(0,1)</w:t>
       </w:r>
       <w:r>
         <w:br/>
@@ -1122,47 +846,7 @@
         <w:t xml:space="preserve"> </w:t>
       </w:r>
       <w:r>
-        <w:t>(-1,0,0</w:t>
-      </w:r>
-      <w:proofErr w:type="gramStart"/>
-      <w:r>
-        <w:t>),(</w:t>
-      </w:r>
-      <w:proofErr w:type="gramEnd"/>
-      <w:r>
-        <w:t>1,0,0</w:t>
-      </w:r>
-      <w:proofErr w:type="gramStart"/>
-      <w:r>
-        <w:t>),(</w:t>
-      </w:r>
-      <w:proofErr w:type="gramEnd"/>
-      <w:r>
-        <w:t>0,-1,0</w:t>
-      </w:r>
-      <w:proofErr w:type="gramStart"/>
-      <w:r>
-        <w:t>),(</w:t>
-      </w:r>
-      <w:proofErr w:type="gramEnd"/>
-      <w:r>
-        <w:t>0,1,0</w:t>
-      </w:r>
-      <w:proofErr w:type="gramStart"/>
-      <w:r>
-        <w:t>),(</w:t>
-      </w:r>
-      <w:proofErr w:type="gramEnd"/>
-      <w:r>
-        <w:t>0,0,-1</w:t>
-      </w:r>
-      <w:proofErr w:type="gramStart"/>
-      <w:r>
-        <w:t>),(</w:t>
-      </w:r>
-      <w:proofErr w:type="gramEnd"/>
-      <w:r>
-        <w:t>0,0,1)</w:t>
+        <w:t>(-1,0,0),(1,0,0),(0,-1,0),(0,1,0),(0,0,-1),(0,0,1)</w:t>
       </w:r>
     </w:p>
     <w:p>
@@ -1173,7 +857,7 @@
     <w:p>
       <w:r>
         <w:pict w14:anchorId="3BE3E9AD">
-          <v:rect id="_x0000_i1857" style="width:0;height:1.5pt" o:hralign="center" o:hrstd="t" o:hr="t" fillcolor="#a0a0a0" stroked="f"/>
+          <v:rect id="_x0000_i1034" style="width:0;height:1.5pt" o:hralign="center" o:hrstd="t" o:hr="t" fillcolor="#a0a0a0" stroked="f"/>
         </w:pict>
       </w:r>
     </w:p>
@@ -1209,14 +893,20 @@
           <w:numId w:val="9"/>
         </w:numPr>
       </w:pPr>
-      <w:proofErr w:type="gramStart"/>
+      <w:r>
+        <w:t>constante ;</w:t>
+      </w:r>
+    </w:p>
+    <w:p>
+      <w:pPr>
+        <w:numPr>
+          <w:ilvl w:val="0"/>
+          <w:numId w:val="9"/>
+        </w:numPr>
+      </w:pPr>
       <w:r>
         <w:lastRenderedPageBreak/>
-        <w:t>constante</w:t>
-      </w:r>
-      <w:proofErr w:type="gramEnd"/>
-      <w:r>
-        <w:t xml:space="preserve"> ;</w:t>
+        <w:t>mathématique ;</w:t>
       </w:r>
     </w:p>
     <w:p>
@@ -1226,35 +916,14 @@
           <w:numId w:val="9"/>
         </w:numPr>
       </w:pPr>
-      <w:proofErr w:type="gramStart"/>
-      <w:r>
-        <w:t>mathématique</w:t>
-      </w:r>
-      <w:proofErr w:type="gramEnd"/>
-      <w:r>
-        <w:t xml:space="preserve"> ;</w:t>
-      </w:r>
-    </w:p>
-    <w:p>
-      <w:pPr>
-        <w:numPr>
-          <w:ilvl w:val="0"/>
-          <w:numId w:val="9"/>
-        </w:numPr>
-      </w:pPr>
-      <w:proofErr w:type="gramStart"/>
-      <w:r>
-        <w:t>aléatoire</w:t>
-      </w:r>
-      <w:proofErr w:type="gramEnd"/>
-      <w:r>
-        <w:t>.</w:t>
+      <w:r>
+        <w:t>aléatoire.</w:t>
       </w:r>
     </w:p>
     <w:p>
       <w:r>
         <w:pict w14:anchorId="31886CF6">
-          <v:rect id="_x0000_i1858" style="width:0;height:1.5pt" o:hralign="center" o:hrstd="t" o:hr="t" fillcolor="#a0a0a0" stroked="f"/>
+          <v:rect id="_x0000_i1035" style="width:0;height:1.5pt" o:hralign="center" o:hrstd="t" o:hr="t" fillcolor="#a0a0a0" stroked="f"/>
         </w:pict>
       </w:r>
     </w:p>
@@ -1290,13 +959,8 @@
           <w:numId w:val="10"/>
         </w:numPr>
       </w:pPr>
-      <w:proofErr w:type="gramStart"/>
-      <w:r>
-        <w:t>constantes</w:t>
-      </w:r>
-      <w:proofErr w:type="gramEnd"/>
-      <w:r>
-        <w:t xml:space="preserve"> ;</w:t>
+      <w:r>
+        <w:t>constantes ;</w:t>
       </w:r>
     </w:p>
     <w:p>
@@ -1306,13 +970,8 @@
           <w:numId w:val="10"/>
         </w:numPr>
       </w:pPr>
-      <w:proofErr w:type="gramStart"/>
-      <w:r>
-        <w:t>variables</w:t>
-      </w:r>
-      <w:proofErr w:type="gramEnd"/>
-      <w:r>
-        <w:t xml:space="preserve"> ;</w:t>
+      <w:r>
+        <w:t>variables ;</w:t>
       </w:r>
     </w:p>
     <w:p>
@@ -1322,13 +981,8 @@
           <w:numId w:val="10"/>
         </w:numPr>
       </w:pPr>
-      <w:proofErr w:type="gramStart"/>
-      <w:r>
-        <w:t>opérateurs</w:t>
-      </w:r>
-      <w:proofErr w:type="gramEnd"/>
-      <w:r>
-        <w:t xml:space="preserve"> ;</w:t>
+      <w:r>
+        <w:t>opérateurs ;</w:t>
       </w:r>
     </w:p>
     <w:p>
@@ -1338,13 +992,8 @@
           <w:numId w:val="10"/>
         </w:numPr>
       </w:pPr>
-      <w:proofErr w:type="gramStart"/>
-      <w:r>
-        <w:t>fonctions</w:t>
-      </w:r>
-      <w:proofErr w:type="gramEnd"/>
-      <w:r>
-        <w:t>.</w:t>
+      <w:r>
+        <w:t>fonctions.</w:t>
       </w:r>
     </w:p>
     <w:p>
@@ -1355,7 +1004,7 @@
     <w:p>
       <w:r>
         <w:pict w14:anchorId="59C8EE69">
-          <v:rect id="_x0000_i1859" style="width:0;height:1.5pt" o:hralign="center" o:hrstd="t" o:hr="t" fillcolor="#a0a0a0" stroked="f"/>
+          <v:rect id="_x0000_i1036" style="width:0;height:1.5pt" o:hralign="center" o:hrstd="t" o:hr="t" fillcolor="#a0a0a0" stroked="f"/>
         </w:pict>
       </w:r>
     </w:p>
@@ -1386,13 +1035,8 @@
           <w:numId w:val="11"/>
         </w:numPr>
       </w:pPr>
-      <w:proofErr w:type="gramStart"/>
-      <w:r>
-        <w:t>les</w:t>
-      </w:r>
-      <w:proofErr w:type="gramEnd"/>
-      <w:r>
-        <w:t xml:space="preserve"> cellules ;</w:t>
+      <w:r>
+        <w:t>les cellules ;</w:t>
       </w:r>
     </w:p>
     <w:p>
@@ -1402,13 +1046,8 @@
           <w:numId w:val="11"/>
         </w:numPr>
       </w:pPr>
-      <w:proofErr w:type="gramStart"/>
-      <w:r>
-        <w:t>les</w:t>
-      </w:r>
-      <w:proofErr w:type="gramEnd"/>
-      <w:r>
-        <w:t xml:space="preserve"> lois ;</w:t>
+      <w:r>
+        <w:t>les lois ;</w:t>
       </w:r>
     </w:p>
     <w:p>
@@ -1418,13 +1057,8 @@
           <w:numId w:val="11"/>
         </w:numPr>
       </w:pPr>
-      <w:proofErr w:type="gramStart"/>
-      <w:r>
-        <w:t>le</w:t>
-      </w:r>
-      <w:proofErr w:type="gramEnd"/>
-      <w:r>
-        <w:t xml:space="preserve"> temps ;</w:t>
+      <w:r>
+        <w:t>le temps ;</w:t>
       </w:r>
     </w:p>
     <w:p>
@@ -1434,13 +1068,8 @@
           <w:numId w:val="11"/>
         </w:numPr>
       </w:pPr>
-      <w:proofErr w:type="gramStart"/>
-      <w:r>
-        <w:t>les</w:t>
-      </w:r>
-      <w:proofErr w:type="gramEnd"/>
-      <w:r>
-        <w:t xml:space="preserve"> phases de calcul ;</w:t>
+      <w:r>
+        <w:t>les phases de calcul ;</w:t>
       </w:r>
     </w:p>
     <w:p>
@@ -1450,13 +1079,8 @@
           <w:numId w:val="11"/>
         </w:numPr>
       </w:pPr>
-      <w:proofErr w:type="gramStart"/>
-      <w:r>
-        <w:t>les</w:t>
-      </w:r>
-      <w:proofErr w:type="gramEnd"/>
-      <w:r>
-        <w:t xml:space="preserve"> métriques ;</w:t>
+      <w:r>
+        <w:t>les métriques ;</w:t>
       </w:r>
     </w:p>
     <w:p>
@@ -1466,13 +1090,8 @@
           <w:numId w:val="11"/>
         </w:numPr>
       </w:pPr>
-      <w:proofErr w:type="gramStart"/>
-      <w:r>
-        <w:t>la</w:t>
-      </w:r>
-      <w:proofErr w:type="gramEnd"/>
-      <w:r>
-        <w:t xml:space="preserve"> communication avec le moteur.</w:t>
+      <w:r>
+        <w:t>la communication avec le moteur.</w:t>
       </w:r>
     </w:p>
     <w:p>
@@ -1483,7 +1102,7 @@
     <w:p>
       <w:r>
         <w:pict w14:anchorId="0C6F1235">
-          <v:rect id="_x0000_i1860" style="width:0;height:1.5pt" o:hralign="center" o:hrstd="t" o:hr="t" fillcolor="#a0a0a0" stroked="f"/>
+          <v:rect id="_x0000_i1037" style="width:0;height:1.5pt" o:hralign="center" o:hrstd="t" o:hr="t" fillcolor="#a0a0a0" stroked="f"/>
         </w:pict>
       </w:r>
     </w:p>
@@ -1519,30 +1138,20 @@
           <w:numId w:val="12"/>
         </w:numPr>
       </w:pPr>
-      <w:proofErr w:type="gramStart"/>
+      <w:r>
+        <w:t>une expression compilée ;</w:t>
+      </w:r>
+    </w:p>
+    <w:p>
+      <w:pPr>
+        <w:numPr>
+          <w:ilvl w:val="0"/>
+          <w:numId w:val="12"/>
+        </w:numPr>
+      </w:pPr>
       <w:r>
         <w:lastRenderedPageBreak/>
-        <w:t>une</w:t>
-      </w:r>
-      <w:proofErr w:type="gramEnd"/>
-      <w:r>
-        <w:t xml:space="preserve"> expression compilée ;</w:t>
-      </w:r>
-    </w:p>
-    <w:p>
-      <w:pPr>
-        <w:numPr>
-          <w:ilvl w:val="0"/>
-          <w:numId w:val="12"/>
-        </w:numPr>
-      </w:pPr>
-      <w:proofErr w:type="gramStart"/>
-      <w:r>
-        <w:t>un</w:t>
-      </w:r>
-      <w:proofErr w:type="gramEnd"/>
-      <w:r>
-        <w:t xml:space="preserve"> contexte d'exécution.</w:t>
+        <w:t>un contexte d'exécution.</w:t>
       </w:r>
     </w:p>
     <w:p>
@@ -1562,13 +1171,8 @@
           <w:numId w:val="13"/>
         </w:numPr>
       </w:pPr>
-      <w:proofErr w:type="gramStart"/>
-      <w:r>
-        <w:t>ni</w:t>
-      </w:r>
-      <w:proofErr w:type="gramEnd"/>
-      <w:r>
-        <w:t xml:space="preserve"> les cellules ;</w:t>
+      <w:r>
+        <w:t>ni les cellules ;</w:t>
       </w:r>
     </w:p>
     <w:p>
@@ -1578,13 +1182,8 @@
           <w:numId w:val="13"/>
         </w:numPr>
       </w:pPr>
-      <w:proofErr w:type="gramStart"/>
-      <w:r>
-        <w:t>ni</w:t>
-      </w:r>
-      <w:proofErr w:type="gramEnd"/>
-      <w:r>
-        <w:t xml:space="preserve"> les lois ;</w:t>
+      <w:r>
+        <w:t>ni les lois ;</w:t>
       </w:r>
     </w:p>
     <w:p>
@@ -1594,19 +1193,14 @@
           <w:numId w:val="13"/>
         </w:numPr>
       </w:pPr>
-      <w:proofErr w:type="gramStart"/>
-      <w:r>
-        <w:t>ni</w:t>
-      </w:r>
-      <w:proofErr w:type="gramEnd"/>
-      <w:r>
-        <w:t xml:space="preserve"> le domaine scientifique.</w:t>
+      <w:r>
+        <w:t>ni le domaine scientifique.</w:t>
       </w:r>
     </w:p>
     <w:p>
       <w:r>
         <w:pict w14:anchorId="1C1A297D">
-          <v:rect id="_x0000_i1861" style="width:0;height:1.5pt" o:hralign="center" o:hrstd="t" o:hr="t" fillcolor="#a0a0a0" stroked="f"/>
+          <v:rect id="_x0000_i1038" style="width:0;height:1.5pt" o:hralign="center" o:hrstd="t" o:hr="t" fillcolor="#a0a0a0" stroked="f"/>
         </w:pict>
       </w:r>
     </w:p>
@@ -1652,13 +1246,8 @@
           <w:numId w:val="14"/>
         </w:numPr>
       </w:pPr>
-      <w:proofErr w:type="gramStart"/>
-      <w:r>
-        <w:t>création</w:t>
-      </w:r>
-      <w:proofErr w:type="gramEnd"/>
-      <w:r>
-        <w:t xml:space="preserve"> de simulations ;</w:t>
+      <w:r>
+        <w:t>création de simulations ;</w:t>
       </w:r>
     </w:p>
     <w:p>
@@ -1668,13 +1257,8 @@
           <w:numId w:val="14"/>
         </w:numPr>
       </w:pPr>
-      <w:proofErr w:type="gramStart"/>
-      <w:r>
-        <w:t>configuration</w:t>
-      </w:r>
-      <w:proofErr w:type="gramEnd"/>
-      <w:r>
-        <w:t xml:space="preserve"> des paramètres ;</w:t>
+      <w:r>
+        <w:t>configuration des paramètres ;</w:t>
       </w:r>
     </w:p>
     <w:p>
@@ -1684,13 +1268,8 @@
           <w:numId w:val="14"/>
         </w:numPr>
       </w:pPr>
-      <w:proofErr w:type="gramStart"/>
-      <w:r>
-        <w:t>configuration</w:t>
-      </w:r>
-      <w:proofErr w:type="gramEnd"/>
-      <w:r>
-        <w:t xml:space="preserve"> des lois ;</w:t>
+      <w:r>
+        <w:t>configuration des lois ;</w:t>
       </w:r>
     </w:p>
     <w:p>
@@ -1700,13 +1279,8 @@
           <w:numId w:val="14"/>
         </w:numPr>
       </w:pPr>
-      <w:proofErr w:type="gramStart"/>
-      <w:r>
-        <w:t>exécution</w:t>
-      </w:r>
-      <w:proofErr w:type="gramEnd"/>
-      <w:r>
-        <w:t xml:space="preserve"> ;</w:t>
+      <w:r>
+        <w:t>exécution ;</w:t>
       </w:r>
     </w:p>
     <w:p>
@@ -1716,13 +1290,8 @@
           <w:numId w:val="14"/>
         </w:numPr>
       </w:pPr>
-      <w:proofErr w:type="gramStart"/>
-      <w:r>
-        <w:t>accélération</w:t>
-      </w:r>
-      <w:proofErr w:type="gramEnd"/>
-      <w:r>
-        <w:t xml:space="preserve"> temporelle ;</w:t>
+      <w:r>
+        <w:t>accélération temporelle ;</w:t>
       </w:r>
     </w:p>
     <w:p>
@@ -1732,19 +1301,14 @@
           <w:numId w:val="14"/>
         </w:numPr>
       </w:pPr>
-      <w:proofErr w:type="gramStart"/>
-      <w:r>
-        <w:t>retour</w:t>
-      </w:r>
-      <w:proofErr w:type="gramEnd"/>
-      <w:r>
-        <w:t xml:space="preserve"> limité dans le temps.</w:t>
+      <w:r>
+        <w:t>retour limité dans le temps.</w:t>
       </w:r>
     </w:p>
     <w:p>
       <w:r>
         <w:pict w14:anchorId="32B656A9">
-          <v:rect id="_x0000_i1862" style="width:0;height:1.5pt" o:hralign="center" o:hrstd="t" o:hr="t" fillcolor="#a0a0a0" stroked="f"/>
+          <v:rect id="_x0000_i1039" style="width:0;height:1.5pt" o:hralign="center" o:hrstd="t" o:hr="t" fillcolor="#a0a0a0" stroked="f"/>
         </w:pict>
       </w:r>
     </w:p>
@@ -1775,13 +1339,8 @@
           <w:numId w:val="15"/>
         </w:numPr>
       </w:pPr>
-      <w:proofErr w:type="gramStart"/>
-      <w:r>
-        <w:t>créer</w:t>
-      </w:r>
-      <w:proofErr w:type="gramEnd"/>
-      <w:r>
-        <w:t xml:space="preserve"> ses paramètres ;</w:t>
+      <w:r>
+        <w:t>créer ses paramètres ;</w:t>
       </w:r>
     </w:p>
     <w:p>
@@ -1791,13 +1350,8 @@
           <w:numId w:val="15"/>
         </w:numPr>
       </w:pPr>
-      <w:proofErr w:type="gramStart"/>
-      <w:r>
-        <w:t>créer</w:t>
-      </w:r>
-      <w:proofErr w:type="gramEnd"/>
-      <w:r>
-        <w:t xml:space="preserve"> ses lois ;</w:t>
+      <w:r>
+        <w:t>créer ses lois ;</w:t>
       </w:r>
     </w:p>
     <w:p>
@@ -1807,13 +1361,8 @@
           <w:numId w:val="15"/>
         </w:numPr>
       </w:pPr>
-      <w:proofErr w:type="gramStart"/>
-      <w:r>
-        <w:t>définir</w:t>
-      </w:r>
-      <w:proofErr w:type="gramEnd"/>
-      <w:r>
-        <w:t xml:space="preserve"> ses métriques ;</w:t>
+      <w:r>
+        <w:t>définir ses métriques ;</w:t>
       </w:r>
     </w:p>
     <w:p>
@@ -1823,19 +1372,14 @@
           <w:numId w:val="15"/>
         </w:numPr>
       </w:pPr>
-      <w:proofErr w:type="gramStart"/>
-      <w:r>
-        <w:t>utiliser</w:t>
-      </w:r>
-      <w:proofErr w:type="gramEnd"/>
-      <w:r>
-        <w:t xml:space="preserve"> un moteur externe.</w:t>
+      <w:r>
+        <w:t>utiliser un moteur externe.</w:t>
       </w:r>
     </w:p>
     <w:p>
       <w:r>
         <w:pict w14:anchorId="1827585B">
-          <v:rect id="_x0000_i1863" style="width:0;height:1.5pt" o:hralign="center" o:hrstd="t" o:hr="t" fillcolor="#a0a0a0" stroked="f"/>
+          <v:rect id="_x0000_i1040" style="width:0;height:1.5pt" o:hralign="center" o:hrstd="t" o:hr="t" fillcolor="#a0a0a0" stroked="f"/>
         </w:pict>
       </w:r>
     </w:p>
@@ -1856,8 +1400,19 @@
     </w:p>
     <w:p>
       <w:r>
+        <w:t>Le backend gère :</w:t>
+      </w:r>
+    </w:p>
+    <w:p>
+      <w:pPr>
+        <w:numPr>
+          <w:ilvl w:val="0"/>
+          <w:numId w:val="16"/>
+        </w:numPr>
+      </w:pPr>
+      <w:r>
         <w:lastRenderedPageBreak/>
-        <w:t>Le backend gère :</w:t>
+        <w:t>comptes ;</w:t>
       </w:r>
     </w:p>
     <w:p>
@@ -1867,13 +1422,8 @@
           <w:numId w:val="16"/>
         </w:numPr>
       </w:pPr>
-      <w:proofErr w:type="gramStart"/>
-      <w:r>
-        <w:t>comptes</w:t>
-      </w:r>
-      <w:proofErr w:type="gramEnd"/>
-      <w:r>
-        <w:t xml:space="preserve"> ;</w:t>
+      <w:r>
+        <w:t>partage de projets ;</w:t>
       </w:r>
     </w:p>
     <w:p>
@@ -1883,13 +1433,8 @@
           <w:numId w:val="16"/>
         </w:numPr>
       </w:pPr>
-      <w:proofErr w:type="gramStart"/>
-      <w:r>
-        <w:t>partage</w:t>
-      </w:r>
-      <w:proofErr w:type="gramEnd"/>
-      <w:r>
-        <w:t xml:space="preserve"> de projets ;</w:t>
+      <w:r>
+        <w:t>accès concurrents ;</w:t>
       </w:r>
     </w:p>
     <w:p>
@@ -1899,13 +1444,8 @@
           <w:numId w:val="16"/>
         </w:numPr>
       </w:pPr>
-      <w:proofErr w:type="gramStart"/>
-      <w:r>
-        <w:t>accès</w:t>
-      </w:r>
-      <w:proofErr w:type="gramEnd"/>
-      <w:r>
-        <w:t xml:space="preserve"> concurrents ;</w:t>
+      <w:r>
+        <w:t>sauvegardes ;</w:t>
       </w:r>
     </w:p>
     <w:p>
@@ -1915,35 +1455,14 @@
           <w:numId w:val="16"/>
         </w:numPr>
       </w:pPr>
-      <w:proofErr w:type="gramStart"/>
-      <w:r>
-        <w:t>sauvegardes</w:t>
-      </w:r>
-      <w:proofErr w:type="gramEnd"/>
-      <w:r>
-        <w:t xml:space="preserve"> ;</w:t>
-      </w:r>
-    </w:p>
-    <w:p>
-      <w:pPr>
-        <w:numPr>
-          <w:ilvl w:val="0"/>
-          <w:numId w:val="16"/>
-        </w:numPr>
-      </w:pPr>
-      <w:proofErr w:type="gramStart"/>
-      <w:r>
-        <w:t>restauration</w:t>
-      </w:r>
-      <w:proofErr w:type="gramEnd"/>
-      <w:r>
-        <w:t xml:space="preserve"> d'état.</w:t>
+      <w:r>
+        <w:t>restauration d'état.</w:t>
       </w:r>
     </w:p>
     <w:p>
       <w:r>
         <w:pict w14:anchorId="38754F0F">
-          <v:rect id="_x0000_i1864" style="width:0;height:1.5pt" o:hralign="center" o:hrstd="t" o:hr="t" fillcolor="#a0a0a0" stroked="f"/>
+          <v:rect id="_x0000_i1041" style="width:0;height:1.5pt" o:hralign="center" o:hrstd="t" o:hr="t" fillcolor="#a0a0a0" stroked="f"/>
         </w:pict>
       </w:r>
     </w:p>
@@ -2023,7 +1542,7 @@
     <w:p>
       <w:r>
         <w:pict w14:anchorId="0766CE8A">
-          <v:rect id="_x0000_i1865" style="width:0;height:1.5pt" o:hralign="center" o:hrstd="t" o:hr="t" fillcolor="#a0a0a0" stroked="f"/>
+          <v:rect id="_x0000_i1042" style="width:0;height:1.5pt" o:hralign="center" o:hrstd="t" o:hr="t" fillcolor="#a0a0a0" stroked="f"/>
         </w:pict>
       </w:r>
     </w:p>
@@ -2099,7 +1618,7 @@
     <w:p>
       <w:r>
         <w:pict w14:anchorId="0E0E40AE">
-          <v:rect id="_x0000_i1866" style="width:0;height:1.5pt" o:hralign="center" o:hrstd="t" o:hr="t" fillcolor="#a0a0a0" stroked="f"/>
+          <v:rect id="_x0000_i1043" style="width:0;height:1.5pt" o:hralign="center" o:hrstd="t" o:hr="t" fillcolor="#a0a0a0" stroked="f"/>
         </w:pict>
       </w:r>
     </w:p>
@@ -2130,13 +1649,8 @@
           <w:numId w:val="20"/>
         </w:numPr>
       </w:pPr>
-      <w:proofErr w:type="gramStart"/>
-      <w:r>
-        <w:t>analyse</w:t>
-      </w:r>
-      <w:proofErr w:type="gramEnd"/>
-      <w:r>
-        <w:t xml:space="preserve"> les expressions ;</w:t>
+      <w:r>
+        <w:t>analyse les expressions ;</w:t>
       </w:r>
     </w:p>
     <w:p>
@@ -2146,14 +1660,20 @@
           <w:numId w:val="20"/>
         </w:numPr>
       </w:pPr>
-      <w:proofErr w:type="gramStart"/>
+      <w:r>
+        <w:t>vérifie leur validité ;</w:t>
+      </w:r>
+    </w:p>
+    <w:p>
+      <w:pPr>
+        <w:numPr>
+          <w:ilvl w:val="0"/>
+          <w:numId w:val="20"/>
+        </w:numPr>
+      </w:pPr>
       <w:r>
         <w:lastRenderedPageBreak/>
-        <w:t>vérifie</w:t>
-      </w:r>
-      <w:proofErr w:type="gramEnd"/>
-      <w:r>
-        <w:t xml:space="preserve"> leur validité ;</w:t>
+        <w:t>produit un arbre d'expressions ;</w:t>
       </w:r>
     </w:p>
     <w:p>
@@ -2163,13 +1683,8 @@
           <w:numId w:val="20"/>
         </w:numPr>
       </w:pPr>
-      <w:proofErr w:type="gramStart"/>
-      <w:r>
-        <w:t>produit</w:t>
-      </w:r>
-      <w:proofErr w:type="gramEnd"/>
-      <w:r>
-        <w:t xml:space="preserve"> un arbre d'expressions ;</w:t>
+      <w:r>
+        <w:t>applique des optimisations simples ;</w:t>
       </w:r>
     </w:p>
     <w:p>
@@ -2179,35 +1694,14 @@
           <w:numId w:val="20"/>
         </w:numPr>
       </w:pPr>
-      <w:proofErr w:type="gramStart"/>
-      <w:r>
-        <w:t>applique</w:t>
-      </w:r>
-      <w:proofErr w:type="gramEnd"/>
-      <w:r>
-        <w:t xml:space="preserve"> des optimisations simples ;</w:t>
-      </w:r>
-    </w:p>
-    <w:p>
-      <w:pPr>
-        <w:numPr>
-          <w:ilvl w:val="0"/>
-          <w:numId w:val="20"/>
-        </w:numPr>
-      </w:pPr>
-      <w:proofErr w:type="gramStart"/>
-      <w:r>
-        <w:t>génère</w:t>
-      </w:r>
-      <w:proofErr w:type="gramEnd"/>
-      <w:r>
-        <w:t xml:space="preserve"> une représentation intermédiaire immuable.</w:t>
+      <w:r>
+        <w:t>génère une représentation intermédiaire immuable.</w:t>
       </w:r>
     </w:p>
     <w:p>
       <w:r>
         <w:pict w14:anchorId="53D3FDB2">
-          <v:rect id="_x0000_i1867" style="width:0;height:1.5pt" o:hralign="center" o:hrstd="t" o:hr="t" fillcolor="#a0a0a0" stroked="f"/>
+          <v:rect id="_x0000_i1044" style="width:0;height:1.5pt" o:hralign="center" o:hrstd="t" o:hr="t" fillcolor="#a0a0a0" stroked="f"/>
         </w:pict>
       </w:r>
     </w:p>
@@ -2243,13 +1737,8 @@
           <w:numId w:val="21"/>
         </w:numPr>
       </w:pPr>
-      <w:proofErr w:type="gramStart"/>
-      <w:r>
-        <w:t>un</w:t>
-      </w:r>
-      <w:proofErr w:type="gramEnd"/>
-      <w:r>
-        <w:t xml:space="preserve"> moteur C# ;</w:t>
+      <w:r>
+        <w:t>un moteur C# ;</w:t>
       </w:r>
     </w:p>
     <w:p>
@@ -2259,13 +1748,8 @@
           <w:numId w:val="21"/>
         </w:numPr>
       </w:pPr>
-      <w:proofErr w:type="gramStart"/>
-      <w:r>
-        <w:t>un</w:t>
-      </w:r>
-      <w:proofErr w:type="gramEnd"/>
-      <w:r>
-        <w:t xml:space="preserve"> moteur FPGA ;</w:t>
+      <w:r>
+        <w:t>un moteur FPGA ;</w:t>
       </w:r>
     </w:p>
     <w:p>
@@ -2275,19 +1759,14 @@
           <w:numId w:val="21"/>
         </w:numPr>
       </w:pPr>
-      <w:proofErr w:type="gramStart"/>
-      <w:r>
-        <w:t>un</w:t>
-      </w:r>
-      <w:proofErr w:type="gramEnd"/>
-      <w:r>
-        <w:t xml:space="preserve"> moteur utilisateur.</w:t>
+      <w:r>
+        <w:t>un moteur utilisateur.</w:t>
       </w:r>
     </w:p>
     <w:p>
       <w:r>
         <w:pict w14:anchorId="06B86F22">
-          <v:rect id="_x0000_i1868" style="width:0;height:1.5pt" o:hralign="center" o:hrstd="t" o:hr="t" fillcolor="#a0a0a0" stroked="f"/>
+          <v:rect id="_x0000_i1045" style="width:0;height:1.5pt" o:hralign="center" o:hrstd="t" o:hr="t" fillcolor="#a0a0a0" stroked="f"/>
         </w:pict>
       </w:r>
     </w:p>
@@ -2408,14 +1887,14 @@
     <w:p>
       <w:r>
         <w:pict w14:anchorId="6C8C1A2E">
-          <v:rect id="_x0000_i1924" style="width:0;height:1.5pt" o:hralign="center" o:hrstd="t" o:hr="t" fillcolor="#a0a0a0" stroked="f"/>
+          <v:rect id="_x0000_i1046" style="width:0;height:1.5pt" o:hralign="center" o:hrstd="t" o:hr="t" fillcolor="#a0a0a0" stroked="f"/>
         </w:pict>
       </w:r>
     </w:p>
     <w:p>
       <w:r>
         <w:pict w14:anchorId="55D544B4">
-          <v:rect id="_x0000_i1870" style="width:0;height:1.5pt" o:hralign="center" o:hrstd="t" o:hr="t" fillcolor="#a0a0a0" stroked="f"/>
+          <v:rect id="_x0000_i1047" style="width:0;height:1.5pt" o:hralign="center" o:hrstd="t" o:hr="t" fillcolor="#a0a0a0" stroked="f"/>
         </w:pict>
       </w:r>
     </w:p>
@@ -2437,7 +1916,7 @@
     <w:p>
       <w:r>
         <w:pict w14:anchorId="71B9A01A">
-          <v:rect id="_x0000_i1871" style="width:0;height:1.5pt" o:hralign="center" o:hrstd="t" o:hr="t" fillcolor="#a0a0a0" stroked="f"/>
+          <v:rect id="_x0000_i1048" style="width:0;height:1.5pt" o:hralign="center" o:hrstd="t" o:hr="t" fillcolor="#a0a0a0" stroked="f"/>
         </w:pict>
       </w:r>
     </w:p>
@@ -2453,12 +1932,12 @@
           <w:b/>
           <w:bCs/>
         </w:rPr>
+        <w:t>Vision du projet</w:t>
+      </w:r>
+    </w:p>
+    <w:p>
+      <w:r>
         <w:lastRenderedPageBreak/>
-        <w:t>Vision du projet</w:t>
-      </w:r>
-    </w:p>
-    <w:p>
-      <w:r>
         <w:t>Le frontend constitue la couche d'interaction entre l'utilisateur et la simulation.</w:t>
       </w:r>
     </w:p>
@@ -2474,13 +1953,8 @@
           <w:numId w:val="23"/>
         </w:numPr>
       </w:pPr>
-      <w:proofErr w:type="gramStart"/>
-      <w:r>
-        <w:t>de</w:t>
-      </w:r>
-      <w:proofErr w:type="gramEnd"/>
-      <w:r>
-        <w:t xml:space="preserve"> configurer une simulation ;</w:t>
+      <w:r>
+        <w:t>de configurer une simulation ;</w:t>
       </w:r>
     </w:p>
     <w:p>
@@ -2490,13 +1964,8 @@
           <w:numId w:val="23"/>
         </w:numPr>
       </w:pPr>
-      <w:proofErr w:type="gramStart"/>
-      <w:r>
-        <w:t>d'observer</w:t>
-      </w:r>
-      <w:proofErr w:type="gramEnd"/>
-      <w:r>
-        <w:t xml:space="preserve"> son évolution ;</w:t>
+      <w:r>
+        <w:t>d'observer son évolution ;</w:t>
       </w:r>
     </w:p>
     <w:p>
@@ -2506,13 +1975,8 @@
           <w:numId w:val="23"/>
         </w:numPr>
       </w:pPr>
-      <w:proofErr w:type="gramStart"/>
-      <w:r>
-        <w:t>d'analyser</w:t>
-      </w:r>
-      <w:proofErr w:type="gramEnd"/>
-      <w:r>
-        <w:t xml:space="preserve"> son comportement ;</w:t>
+      <w:r>
+        <w:t>d'analyser son comportement ;</w:t>
       </w:r>
     </w:p>
     <w:p>
@@ -2522,13 +1986,8 @@
           <w:numId w:val="23"/>
         </w:numPr>
       </w:pPr>
-      <w:proofErr w:type="gramStart"/>
-      <w:r>
-        <w:t>d'interagir</w:t>
-      </w:r>
-      <w:proofErr w:type="gramEnd"/>
-      <w:r>
-        <w:t xml:space="preserve"> avec sa représentation graphique.</w:t>
+      <w:r>
+        <w:t>d'interagir avec sa représentation graphique.</w:t>
       </w:r>
     </w:p>
     <w:p>
@@ -2544,7 +2003,7 @@
     <w:p>
       <w:r>
         <w:pict w14:anchorId="7940092B">
-          <v:rect id="_x0000_i1872" style="width:0;height:1.5pt" o:hralign="center" o:hrstd="t" o:hr="t" fillcolor="#a0a0a0" stroked="f"/>
+          <v:rect id="_x0000_i1049" style="width:0;height:1.5pt" o:hralign="center" o:hrstd="t" o:hr="t" fillcolor="#a0a0a0" stroked="f"/>
         </w:pict>
       </w:r>
     </w:p>
@@ -2595,13 +2054,8 @@
           <w:numId w:val="24"/>
         </w:numPr>
       </w:pPr>
-      <w:proofErr w:type="gramStart"/>
-      <w:r>
-        <w:t>affichage</w:t>
-      </w:r>
-      <w:proofErr w:type="gramEnd"/>
-      <w:r>
-        <w:t xml:space="preserve"> des cellules ;</w:t>
+      <w:r>
+        <w:t>affichage des cellules ;</w:t>
       </w:r>
     </w:p>
     <w:p>
@@ -2611,13 +2065,8 @@
           <w:numId w:val="24"/>
         </w:numPr>
       </w:pPr>
-      <w:proofErr w:type="gramStart"/>
-      <w:r>
-        <w:t>représentation</w:t>
-      </w:r>
-      <w:proofErr w:type="gramEnd"/>
-      <w:r>
-        <w:t xml:space="preserve"> des valeurs ;</w:t>
+      <w:r>
+        <w:t>représentation des valeurs ;</w:t>
       </w:r>
     </w:p>
     <w:p>
@@ -2627,13 +2076,8 @@
           <w:numId w:val="24"/>
         </w:numPr>
       </w:pPr>
-      <w:proofErr w:type="gramStart"/>
-      <w:r>
-        <w:t>zoom</w:t>
-      </w:r>
-      <w:proofErr w:type="gramEnd"/>
-      <w:r>
-        <w:t xml:space="preserve"> ;</w:t>
+      <w:r>
+        <w:t>zoom ;</w:t>
       </w:r>
     </w:p>
     <w:p>
@@ -2643,13 +2087,8 @@
           <w:numId w:val="24"/>
         </w:numPr>
       </w:pPr>
-      <w:proofErr w:type="gramStart"/>
-      <w:r>
-        <w:t>déplacement</w:t>
-      </w:r>
-      <w:proofErr w:type="gramEnd"/>
-      <w:r>
-        <w:t xml:space="preserve"> ;</w:t>
+      <w:r>
+        <w:t>déplacement ;</w:t>
       </w:r>
     </w:p>
     <w:p>
@@ -2659,19 +2098,14 @@
           <w:numId w:val="24"/>
         </w:numPr>
       </w:pPr>
-      <w:proofErr w:type="gramStart"/>
-      <w:r>
-        <w:t>sélection</w:t>
-      </w:r>
-      <w:proofErr w:type="gramEnd"/>
-      <w:r>
-        <w:t xml:space="preserve"> d'une loi.</w:t>
+      <w:r>
+        <w:t>sélection d'une loi.</w:t>
       </w:r>
     </w:p>
     <w:p>
       <w:r>
         <w:pict w14:anchorId="28AC9D0D">
-          <v:rect id="_x0000_i1873" style="width:0;height:1.5pt" o:hralign="center" o:hrstd="t" o:hr="t" fillcolor="#a0a0a0" stroked="f"/>
+          <v:rect id="_x0000_i1050" style="width:0;height:1.5pt" o:hralign="center" o:hrstd="t" o:hr="t" fillcolor="#a0a0a0" stroked="f"/>
         </w:pict>
       </w:r>
     </w:p>
@@ -2707,13 +2141,8 @@
           <w:numId w:val="25"/>
         </w:numPr>
       </w:pPr>
-      <w:proofErr w:type="gramStart"/>
-      <w:r>
-        <w:t>loi</w:t>
-      </w:r>
-      <w:proofErr w:type="gramEnd"/>
-      <w:r>
-        <w:t xml:space="preserve"> ou paramètre observé ;</w:t>
+      <w:r>
+        <w:t>loi ou paramètre observé ;</w:t>
       </w:r>
     </w:p>
     <w:p>
@@ -2723,13 +2152,8 @@
           <w:numId w:val="25"/>
         </w:numPr>
       </w:pPr>
-      <w:proofErr w:type="gramStart"/>
-      <w:r>
-        <w:t>gradient</w:t>
-      </w:r>
-      <w:proofErr w:type="gramEnd"/>
-      <w:r>
-        <w:t xml:space="preserve"> ;</w:t>
+      <w:r>
+        <w:t>gradient ;</w:t>
       </w:r>
     </w:p>
     <w:p>
@@ -2739,13 +2163,8 @@
           <w:numId w:val="25"/>
         </w:numPr>
       </w:pPr>
-      <w:proofErr w:type="gramStart"/>
-      <w:r>
-        <w:t>bornes</w:t>
-      </w:r>
-      <w:proofErr w:type="gramEnd"/>
-      <w:r>
-        <w:t xml:space="preserve"> ;</w:t>
+      <w:r>
+        <w:t>bornes ;</w:t>
       </w:r>
     </w:p>
     <w:p>
@@ -2755,20 +2174,15 @@
           <w:numId w:val="25"/>
         </w:numPr>
       </w:pPr>
-      <w:proofErr w:type="gramStart"/>
+      <w:r>
+        <w:t>interpolation.</w:t>
+      </w:r>
+    </w:p>
+    <w:p>
       <w:r>
         <w:lastRenderedPageBreak/>
-        <w:t>interpolation</w:t>
-      </w:r>
-      <w:proofErr w:type="gramEnd"/>
-      <w:r>
-        <w:t>.</w:t>
-      </w:r>
-    </w:p>
-    <w:p>
-      <w:r>
         <w:pict w14:anchorId="0111BAE4">
-          <v:rect id="_x0000_i1874" style="width:0;height:1.5pt" o:hralign="center" o:hrstd="t" o:hr="t" fillcolor="#a0a0a0" stroked="f"/>
+          <v:rect id="_x0000_i1051" style="width:0;height:1.5pt" o:hralign="center" o:hrstd="t" o:hr="t" fillcolor="#a0a0a0" stroked="f"/>
         </w:pict>
       </w:r>
     </w:p>
@@ -2793,13 +2207,8 @@
       </w:r>
     </w:p>
     <w:p>
-      <w:proofErr w:type="gramStart"/>
-      <w:r>
-        <w:t>valeur</w:t>
-      </w:r>
-      <w:proofErr w:type="gramEnd"/>
-      <w:r>
-        <w:t xml:space="preserve"> </w:t>
+      <w:r>
+        <w:t xml:space="preserve">valeur </w:t>
       </w:r>
       <w:r>
         <w:t>→</w:t>
@@ -2821,7 +2230,7 @@
     <w:p>
       <w:r>
         <w:pict w14:anchorId="203B7507">
-          <v:rect id="_x0000_i1875" style="width:0;height:1.5pt" o:hralign="center" o:hrstd="t" o:hr="t" fillcolor="#a0a0a0" stroked="f"/>
+          <v:rect id="_x0000_i1052" style="width:0;height:1.5pt" o:hralign="center" o:hrstd="t" o:hr="t" fillcolor="#a0a0a0" stroked="f"/>
         </w:pict>
       </w:r>
     </w:p>
@@ -2857,13 +2266,8 @@
           <w:numId w:val="26"/>
         </w:numPr>
       </w:pPr>
-      <w:proofErr w:type="gramStart"/>
-      <w:r>
-        <w:t>analyser</w:t>
-      </w:r>
-      <w:proofErr w:type="gramEnd"/>
-      <w:r>
-        <w:t xml:space="preserve"> une influence ;</w:t>
+      <w:r>
+        <w:t>analyser une influence ;</w:t>
       </w:r>
     </w:p>
     <w:p>
@@ -2873,13 +2277,8 @@
           <w:numId w:val="26"/>
         </w:numPr>
       </w:pPr>
-      <w:proofErr w:type="gramStart"/>
-      <w:r>
-        <w:t>observer</w:t>
-      </w:r>
-      <w:proofErr w:type="gramEnd"/>
-      <w:r>
-        <w:t xml:space="preserve"> une propagation ;</w:t>
+      <w:r>
+        <w:t>observer une propagation ;</w:t>
       </w:r>
     </w:p>
     <w:p>
@@ -2889,19 +2288,14 @@
           <w:numId w:val="26"/>
         </w:numPr>
       </w:pPr>
-      <w:proofErr w:type="gramStart"/>
-      <w:r>
-        <w:t>comparer</w:t>
-      </w:r>
-      <w:proofErr w:type="gramEnd"/>
-      <w:r>
-        <w:t xml:space="preserve"> différentes lois.</w:t>
+      <w:r>
+        <w:t>comparer différentes lois.</w:t>
       </w:r>
     </w:p>
     <w:p>
       <w:r>
         <w:pict w14:anchorId="240549DD">
-          <v:rect id="_x0000_i1876" style="width:0;height:1.5pt" o:hralign="center" o:hrstd="t" o:hr="t" fillcolor="#a0a0a0" stroked="f"/>
+          <v:rect id="_x0000_i1053" style="width:0;height:1.5pt" o:hralign="center" o:hrstd="t" o:hr="t" fillcolor="#a0a0a0" stroked="f"/>
         </w:pict>
       </w:r>
     </w:p>
@@ -2947,13 +2341,8 @@
           <w:numId w:val="27"/>
         </w:numPr>
       </w:pPr>
-      <w:proofErr w:type="gramStart"/>
-      <w:r>
-        <w:t>affichage</w:t>
-      </w:r>
-      <w:proofErr w:type="gramEnd"/>
-      <w:r>
-        <w:t xml:space="preserve"> des cellules ;</w:t>
+      <w:r>
+        <w:t>affichage des cellules ;</w:t>
       </w:r>
     </w:p>
     <w:p>
@@ -2963,13 +2352,8 @@
           <w:numId w:val="27"/>
         </w:numPr>
       </w:pPr>
-      <w:proofErr w:type="gramStart"/>
-      <w:r>
-        <w:t>affichage</w:t>
-      </w:r>
-      <w:proofErr w:type="gramEnd"/>
-      <w:r>
-        <w:t xml:space="preserve"> par couleurs ;</w:t>
+      <w:r>
+        <w:t>affichage par couleurs ;</w:t>
       </w:r>
     </w:p>
     <w:p>
@@ -2979,13 +2363,8 @@
           <w:numId w:val="27"/>
         </w:numPr>
       </w:pPr>
-      <w:proofErr w:type="gramStart"/>
-      <w:r>
-        <w:t>zoom</w:t>
-      </w:r>
-      <w:proofErr w:type="gramEnd"/>
-      <w:r>
-        <w:t xml:space="preserve"> ;</w:t>
+      <w:r>
+        <w:t>zoom ;</w:t>
       </w:r>
     </w:p>
     <w:p>
@@ -2995,13 +2374,8 @@
           <w:numId w:val="27"/>
         </w:numPr>
       </w:pPr>
-      <w:proofErr w:type="gramStart"/>
-      <w:r>
-        <w:t>déplacement</w:t>
-      </w:r>
-      <w:proofErr w:type="gramEnd"/>
-      <w:r>
-        <w:t xml:space="preserve"> ;</w:t>
+      <w:r>
+        <w:t>déplacement ;</w:t>
       </w:r>
     </w:p>
     <w:p>
@@ -3011,13 +2385,8 @@
           <w:numId w:val="27"/>
         </w:numPr>
       </w:pPr>
-      <w:proofErr w:type="gramStart"/>
-      <w:r>
-        <w:t>sélection</w:t>
-      </w:r>
-      <w:proofErr w:type="gramEnd"/>
-      <w:r>
-        <w:t xml:space="preserve"> d'une loi ;</w:t>
+      <w:r>
+        <w:t>sélection d'une loi ;</w:t>
       </w:r>
     </w:p>
     <w:p>
@@ -3027,19 +2396,14 @@
           <w:numId w:val="27"/>
         </w:numPr>
       </w:pPr>
-      <w:proofErr w:type="gramStart"/>
-      <w:r>
-        <w:t>affichage</w:t>
-      </w:r>
-      <w:proofErr w:type="gramEnd"/>
-      <w:r>
-        <w:t xml:space="preserve"> de légendes.</w:t>
+      <w:r>
+        <w:t>affichage de légendes.</w:t>
       </w:r>
     </w:p>
     <w:p>
       <w:r>
         <w:pict w14:anchorId="79EF6ABA">
-          <v:rect id="_x0000_i1877" style="width:0;height:1.5pt" o:hralign="center" o:hrstd="t" o:hr="t" fillcolor="#a0a0a0" stroked="f"/>
+          <v:rect id="_x0000_i1054" style="width:0;height:1.5pt" o:hralign="center" o:hrstd="t" o:hr="t" fillcolor="#a0a0a0" stroked="f"/>
         </w:pict>
       </w:r>
     </w:p>
@@ -3060,8 +2424,19 @@
     </w:p>
     <w:p>
       <w:r>
+        <w:t>La première version affiche uniquement des informations textuelles :</w:t>
+      </w:r>
+    </w:p>
+    <w:p>
+      <w:pPr>
+        <w:numPr>
+          <w:ilvl w:val="0"/>
+          <w:numId w:val="28"/>
+        </w:numPr>
+      </w:pPr>
+      <w:r>
         <w:lastRenderedPageBreak/>
-        <w:t>La première version affiche uniquement des informations textuelles :</w:t>
+        <w:t>moyenne ;</w:t>
       </w:r>
     </w:p>
     <w:p>
@@ -3071,13 +2446,8 @@
           <w:numId w:val="28"/>
         </w:numPr>
       </w:pPr>
-      <w:proofErr w:type="gramStart"/>
-      <w:r>
-        <w:t>moyenne</w:t>
-      </w:r>
-      <w:proofErr w:type="gramEnd"/>
-      <w:r>
-        <w:t xml:space="preserve"> ;</w:t>
+      <w:r>
+        <w:t>maximum ;</w:t>
       </w:r>
     </w:p>
     <w:p>
@@ -3087,13 +2457,8 @@
           <w:numId w:val="28"/>
         </w:numPr>
       </w:pPr>
-      <w:proofErr w:type="gramStart"/>
-      <w:r>
-        <w:t>maximum</w:t>
-      </w:r>
-      <w:proofErr w:type="gramEnd"/>
-      <w:r>
-        <w:t xml:space="preserve"> ;</w:t>
+      <w:r>
+        <w:t>minimum ;</w:t>
       </w:r>
     </w:p>
     <w:p>
@@ -3103,13 +2468,8 @@
           <w:numId w:val="28"/>
         </w:numPr>
       </w:pPr>
-      <w:proofErr w:type="gramStart"/>
-      <w:r>
-        <w:t>minimum</w:t>
-      </w:r>
-      <w:proofErr w:type="gramEnd"/>
-      <w:r>
-        <w:t xml:space="preserve"> ;</w:t>
+      <w:r>
+        <w:t>nombre de cellules actives ;</w:t>
       </w:r>
     </w:p>
     <w:p>
@@ -3119,29 +2479,8 @@
           <w:numId w:val="28"/>
         </w:numPr>
       </w:pPr>
-      <w:proofErr w:type="gramStart"/>
-      <w:r>
-        <w:t>nombre</w:t>
-      </w:r>
-      <w:proofErr w:type="gramEnd"/>
-      <w:r>
-        <w:t xml:space="preserve"> de cellules actives ;</w:t>
-      </w:r>
-    </w:p>
-    <w:p>
-      <w:pPr>
-        <w:numPr>
-          <w:ilvl w:val="0"/>
-          <w:numId w:val="28"/>
-        </w:numPr>
-      </w:pPr>
-      <w:proofErr w:type="gramStart"/>
-      <w:r>
-        <w:t>nombre</w:t>
-      </w:r>
-      <w:proofErr w:type="gramEnd"/>
-      <w:r>
-        <w:t xml:space="preserve"> de tours.</w:t>
+      <w:r>
+        <w:t>nombre de tours.</w:t>
       </w:r>
     </w:p>
     <w:p>
@@ -3152,7 +2491,7 @@
     <w:p>
       <w:r>
         <w:pict w14:anchorId="70DE560B">
-          <v:rect id="_x0000_i1878" style="width:0;height:1.5pt" o:hralign="center" o:hrstd="t" o:hr="t" fillcolor="#a0a0a0" stroked="f"/>
+          <v:rect id="_x0000_i1055" style="width:0;height:1.5pt" o:hralign="center" o:hrstd="t" o:hr="t" fillcolor="#a0a0a0" stroked="f"/>
         </w:pict>
       </w:r>
     </w:p>
@@ -3198,13 +2537,8 @@
           <w:numId w:val="29"/>
         </w:numPr>
       </w:pPr>
-      <w:proofErr w:type="spellStart"/>
-      <w:r>
-        <w:t>React</w:t>
-      </w:r>
-      <w:proofErr w:type="spellEnd"/>
-      <w:r>
-        <w:t xml:space="preserve"> ;</w:t>
+      <w:r>
+        <w:t>React ;</w:t>
       </w:r>
     </w:p>
     <w:p>
@@ -3214,13 +2548,8 @@
           <w:numId w:val="29"/>
         </w:numPr>
       </w:pPr>
-      <w:proofErr w:type="spellStart"/>
-      <w:r>
-        <w:t>TypeScript</w:t>
-      </w:r>
-      <w:proofErr w:type="spellEnd"/>
-      <w:r>
-        <w:t xml:space="preserve"> ;</w:t>
+      <w:r>
+        <w:t>TypeScript ;</w:t>
       </w:r>
     </w:p>
     <w:p>
@@ -3248,7 +2577,7 @@
     <w:p>
       <w:r>
         <w:pict w14:anchorId="1C97DEF5">
-          <v:rect id="_x0000_i1879" style="width:0;height:1.5pt" o:hralign="center" o:hrstd="t" o:hr="t" fillcolor="#a0a0a0" stroked="f"/>
+          <v:rect id="_x0000_i1056" style="width:0;height:1.5pt" o:hralign="center" o:hrstd="t" o:hr="t" fillcolor="#a0a0a0" stroked="f"/>
         </w:pict>
       </w:r>
     </w:p>
@@ -3273,7 +2602,6 @@
       </w:r>
     </w:p>
     <w:p>
-      <w:proofErr w:type="spellStart"/>
       <w:r>
         <w:rPr>
           <w:b/>
@@ -3281,7 +2609,6 @@
         </w:rPr>
         <w:t>PixiJS</w:t>
       </w:r>
-      <w:proofErr w:type="spellEnd"/>
     </w:p>
     <w:p>
       <w:r>
@@ -3300,13 +2627,8 @@
           <w:numId w:val="30"/>
         </w:numPr>
       </w:pPr>
-      <w:proofErr w:type="gramStart"/>
-      <w:r>
-        <w:t>accélération</w:t>
-      </w:r>
-      <w:proofErr w:type="gramEnd"/>
-      <w:r>
-        <w:t xml:space="preserve"> GPU ;</w:t>
+      <w:r>
+        <w:t>accélération GPU ;</w:t>
       </w:r>
     </w:p>
     <w:p>
@@ -3316,13 +2638,8 @@
           <w:numId w:val="30"/>
         </w:numPr>
       </w:pPr>
-      <w:proofErr w:type="gramStart"/>
-      <w:r>
-        <w:t>bonnes</w:t>
-      </w:r>
-      <w:proofErr w:type="gramEnd"/>
-      <w:r>
-        <w:t xml:space="preserve"> performances ;</w:t>
+      <w:r>
+        <w:t>bonnes performances ;</w:t>
       </w:r>
     </w:p>
     <w:p>
@@ -3332,21 +2649,8 @@
           <w:numId w:val="30"/>
         </w:numPr>
       </w:pPr>
-      <w:proofErr w:type="gramStart"/>
-      <w:r>
-        <w:t>compatibilité</w:t>
-      </w:r>
-      <w:proofErr w:type="gramEnd"/>
-      <w:r>
-        <w:t xml:space="preserve"> </w:t>
-      </w:r>
-      <w:proofErr w:type="spellStart"/>
-      <w:r>
-        <w:t>TypeScript</w:t>
-      </w:r>
-      <w:proofErr w:type="spellEnd"/>
-      <w:r>
-        <w:t xml:space="preserve"> ;</w:t>
+      <w:r>
+        <w:t>compatibilité TypeScript ;</w:t>
       </w:r>
     </w:p>
     <w:p>
@@ -3356,19 +2660,14 @@
           <w:numId w:val="30"/>
         </w:numPr>
       </w:pPr>
-      <w:proofErr w:type="gramStart"/>
-      <w:r>
-        <w:t>adaptée</w:t>
-      </w:r>
-      <w:proofErr w:type="gramEnd"/>
-      <w:r>
-        <w:t xml:space="preserve"> aux grandes grilles.</w:t>
+      <w:r>
+        <w:t>adaptée aux grandes grilles.</w:t>
       </w:r>
     </w:p>
     <w:p>
       <w:r>
         <w:pict w14:anchorId="09511355">
-          <v:rect id="_x0000_i1880" style="width:0;height:1.5pt" o:hralign="center" o:hrstd="t" o:hr="t" fillcolor="#a0a0a0" stroked="f"/>
+          <v:rect id="_x0000_i1057" style="width:0;height:1.5pt" o:hralign="center" o:hrstd="t" o:hr="t" fillcolor="#a0a0a0" stroked="f"/>
         </w:pict>
       </w:r>
     </w:p>
@@ -3384,12 +2683,12 @@
           <w:b/>
           <w:bCs/>
         </w:rPr>
+        <w:t>Architecture du rendu</w:t>
+      </w:r>
+    </w:p>
+    <w:p>
+      <w:r>
         <w:lastRenderedPageBreak/>
-        <w:t>Architecture du rendu</w:t>
-      </w:r>
-    </w:p>
-    <w:p>
-      <w:r>
         <w:t>Simulation</w:t>
       </w:r>
     </w:p>
@@ -3401,11 +2700,9 @@
     </w:p>
     <w:p/>
     <w:p>
-      <w:proofErr w:type="spellStart"/>
       <w:r>
         <w:t>Etat</w:t>
       </w:r>
-      <w:proofErr w:type="spellEnd"/>
     </w:p>
     <w:p/>
     <w:p>
@@ -3427,23 +2724,13 @@
     </w:p>
     <w:p/>
     <w:p>
-      <w:proofErr w:type="spellStart"/>
       <w:r>
         <w:t>PixiJS</w:t>
       </w:r>
-      <w:proofErr w:type="spellEnd"/>
-    </w:p>
-    <w:p>
-      <w:r>
-        <w:t xml:space="preserve">Le </w:t>
-      </w:r>
-      <w:proofErr w:type="spellStart"/>
-      <w:r>
-        <w:t>renderer</w:t>
-      </w:r>
-      <w:proofErr w:type="spellEnd"/>
-      <w:r>
-        <w:t xml:space="preserve"> reçoit uniquement :</w:t>
+    </w:p>
+    <w:p>
+      <w:r>
+        <w:t>Le renderer reçoit uniquement :</w:t>
       </w:r>
     </w:p>
     <w:p>
@@ -3453,13 +2740,8 @@
           <w:numId w:val="31"/>
         </w:numPr>
       </w:pPr>
-      <w:proofErr w:type="gramStart"/>
-      <w:r>
-        <w:t>positions</w:t>
-      </w:r>
-      <w:proofErr w:type="gramEnd"/>
-      <w:r>
-        <w:t xml:space="preserve"> ;</w:t>
+      <w:r>
+        <w:t>positions ;</w:t>
       </w:r>
     </w:p>
     <w:p>
@@ -3469,13 +2751,8 @@
           <w:numId w:val="31"/>
         </w:numPr>
       </w:pPr>
-      <w:proofErr w:type="gramStart"/>
-      <w:r>
-        <w:t>valeurs</w:t>
-      </w:r>
-      <w:proofErr w:type="gramEnd"/>
-      <w:r>
-        <w:t xml:space="preserve"> ;</w:t>
+      <w:r>
+        <w:t>valeurs ;</w:t>
       </w:r>
     </w:p>
     <w:p>
@@ -3485,13 +2762,8 @@
           <w:numId w:val="31"/>
         </w:numPr>
       </w:pPr>
-      <w:proofErr w:type="gramStart"/>
-      <w:r>
-        <w:t>configuration</w:t>
-      </w:r>
-      <w:proofErr w:type="gramEnd"/>
-      <w:r>
-        <w:t xml:space="preserve"> graphique.</w:t>
+      <w:r>
+        <w:t>configuration graphique.</w:t>
       </w:r>
     </w:p>
     <w:p>
@@ -3506,13 +2778,8 @@
           <w:numId w:val="32"/>
         </w:numPr>
       </w:pPr>
-      <w:proofErr w:type="gramStart"/>
-      <w:r>
-        <w:t>les</w:t>
-      </w:r>
-      <w:proofErr w:type="gramEnd"/>
-      <w:r>
-        <w:t xml:space="preserve"> lois ;</w:t>
+      <w:r>
+        <w:t>les lois ;</w:t>
       </w:r>
     </w:p>
     <w:p>
@@ -3522,13 +2789,8 @@
           <w:numId w:val="32"/>
         </w:numPr>
       </w:pPr>
-      <w:proofErr w:type="gramStart"/>
-      <w:r>
-        <w:t>les</w:t>
-      </w:r>
-      <w:proofErr w:type="gramEnd"/>
-      <w:r>
-        <w:t xml:space="preserve"> formules ;</w:t>
+      <w:r>
+        <w:t>les formules ;</w:t>
       </w:r>
     </w:p>
     <w:p>
@@ -3538,19 +2800,14 @@
           <w:numId w:val="32"/>
         </w:numPr>
       </w:pPr>
-      <w:proofErr w:type="gramStart"/>
-      <w:r>
-        <w:t>le</w:t>
-      </w:r>
-      <w:proofErr w:type="gramEnd"/>
-      <w:r>
-        <w:t xml:space="preserve"> moteur de calcul.</w:t>
+      <w:r>
+        <w:t>le moteur de calcul.</w:t>
       </w:r>
     </w:p>
     <w:p>
       <w:r>
         <w:pict w14:anchorId="065F4B72">
-          <v:rect id="_x0000_i1881" style="width:0;height:1.5pt" o:hralign="center" o:hrstd="t" o:hr="t" fillcolor="#a0a0a0" stroked="f"/>
+          <v:rect id="_x0000_i1058" style="width:0;height:1.5pt" o:hralign="center" o:hrstd="t" o:hr="t" fillcolor="#a0a0a0" stroked="f"/>
         </w:pict>
       </w:r>
     </w:p>
@@ -3581,8 +2838,19 @@
     </w:p>
     <w:p>
       <w:r>
+        <w:t>Cette extension ne modifierait pas :</w:t>
+      </w:r>
+    </w:p>
+    <w:p>
+      <w:pPr>
+        <w:numPr>
+          <w:ilvl w:val="0"/>
+          <w:numId w:val="33"/>
+        </w:numPr>
+      </w:pPr>
+      <w:r>
         <w:lastRenderedPageBreak/>
-        <w:t>Cette extension ne modifierait pas :</w:t>
+        <w:t>le domaine ;</w:t>
       </w:r>
     </w:p>
     <w:p>
@@ -3592,13 +2860,8 @@
           <w:numId w:val="33"/>
         </w:numPr>
       </w:pPr>
-      <w:proofErr w:type="gramStart"/>
-      <w:r>
-        <w:t>le</w:t>
-      </w:r>
-      <w:proofErr w:type="gramEnd"/>
-      <w:r>
-        <w:t xml:space="preserve"> domaine ;</w:t>
+      <w:r>
+        <w:t>les lois ;</w:t>
       </w:r>
     </w:p>
     <w:p>
@@ -3608,13 +2871,8 @@
           <w:numId w:val="33"/>
         </w:numPr>
       </w:pPr>
-      <w:proofErr w:type="gramStart"/>
-      <w:r>
-        <w:t>les</w:t>
-      </w:r>
-      <w:proofErr w:type="gramEnd"/>
-      <w:r>
-        <w:t xml:space="preserve"> lois ;</w:t>
+      <w:r>
+        <w:t>les moteurs ;</w:t>
       </w:r>
     </w:p>
     <w:p>
@@ -3624,35 +2882,14 @@
           <w:numId w:val="33"/>
         </w:numPr>
       </w:pPr>
-      <w:proofErr w:type="gramStart"/>
-      <w:r>
-        <w:t>les</w:t>
-      </w:r>
-      <w:proofErr w:type="gramEnd"/>
-      <w:r>
-        <w:t xml:space="preserve"> moteurs ;</w:t>
-      </w:r>
-    </w:p>
-    <w:p>
-      <w:pPr>
-        <w:numPr>
-          <w:ilvl w:val="0"/>
-          <w:numId w:val="33"/>
-        </w:numPr>
-      </w:pPr>
-      <w:proofErr w:type="gramStart"/>
-      <w:r>
-        <w:t>le</w:t>
-      </w:r>
-      <w:proofErr w:type="gramEnd"/>
-      <w:r>
-        <w:t xml:space="preserve"> simulateur.</w:t>
+      <w:r>
+        <w:t>le simulateur.</w:t>
       </w:r>
     </w:p>
     <w:p>
       <w:r>
         <w:pict w14:anchorId="10DE044C">
-          <v:rect id="_x0000_i1882" style="width:0;height:1.5pt" o:hralign="center" o:hrstd="t" o:hr="t" fillcolor="#a0a0a0" stroked="f"/>
+          <v:rect id="_x0000_i1059" style="width:0;height:1.5pt" o:hralign="center" o:hrstd="t" o:hr="t" fillcolor="#a0a0a0" stroked="f"/>
         </w:pict>
       </w:r>
     </w:p>
@@ -3700,13 +2937,8 @@
           <w:numId w:val="34"/>
         </w:numPr>
       </w:pPr>
-      <w:proofErr w:type="spellStart"/>
-      <w:r>
-        <w:t>PixiJS</w:t>
-      </w:r>
-      <w:proofErr w:type="spellEnd"/>
-      <w:r>
-        <w:t xml:space="preserve"> n'est qu'une implémentation du rendu.</w:t>
+      <w:r>
+        <w:t>PixiJS n'est qu'une implémentation du rendu.</w:t>
       </w:r>
     </w:p>
     <w:p>
@@ -3745,7 +2977,7 @@
     <w:p>
       <w:r>
         <w:pict w14:anchorId="30578DB5">
-          <v:rect id="_x0000_i1927" style="width:0;height:1.5pt" o:hralign="center" o:hrstd="t" o:hr="t" fillcolor="#a0a0a0" stroked="f"/>
+          <v:rect id="_x0000_i1060" style="width:0;height:1.5pt" o:hralign="center" o:hrstd="t" o:hr="t" fillcolor="#a0a0a0" stroked="f"/>
         </w:pict>
       </w:r>
     </w:p>
@@ -3776,31 +3008,7 @@
         <w:t>Visual Studio Code</w:t>
       </w:r>
       <w:r>
-        <w:t xml:space="preserve"> pour sa polyvalence (Frontend </w:t>
-      </w:r>
-      <w:proofErr w:type="spellStart"/>
-      <w:r>
-        <w:t>React</w:t>
-      </w:r>
-      <w:proofErr w:type="spellEnd"/>
-      <w:r>
-        <w:t>/</w:t>
-      </w:r>
-      <w:proofErr w:type="spellStart"/>
-      <w:r>
-        <w:t>TypeScript</w:t>
-      </w:r>
-      <w:proofErr w:type="spellEnd"/>
-      <w:r>
-        <w:t xml:space="preserve">, documentation </w:t>
-      </w:r>
-      <w:proofErr w:type="spellStart"/>
-      <w:r>
-        <w:t>Mermaid</w:t>
-      </w:r>
-      <w:proofErr w:type="spellEnd"/>
-      <w:r>
-        <w:t>, Git, outils web).</w:t>
+        <w:t xml:space="preserve"> pour sa polyvalence (Frontend React/TypeScript, documentation Mermaid, Git, outils web).</w:t>
       </w:r>
       <w:r>
         <w:br/>
@@ -3814,15 +3022,7 @@
         <w:t>Visual Studio Community</w:t>
       </w:r>
       <w:r>
-        <w:t xml:space="preserve">, déjà installé, afin de bénéficier des outils avancés de l'écosystème .NET : débogage, gestion des solutions, tests et </w:t>
-      </w:r>
-      <w:proofErr w:type="spellStart"/>
-      <w:r>
-        <w:t>refactoring</w:t>
-      </w:r>
-      <w:proofErr w:type="spellEnd"/>
-      <w:r>
-        <w:t>.</w:t>
+        <w:t>, déjà installé, afin de bénéficier des outils avancés de l'écosystème .NET : débogage, gestion des solutions, tests et refactoring.</w:t>
       </w:r>
       <w:r>
         <w:br/>
@@ -3830,15 +3030,7 @@
       </w:r>
       <w:r>
         <w:br/>
-        <w:t xml:space="preserve">Des extensions complémentaires seront utilisées pour améliorer l'expérience de développement : support C#, </w:t>
-      </w:r>
-      <w:proofErr w:type="spellStart"/>
-      <w:r>
-        <w:t>Mermaid</w:t>
-      </w:r>
-      <w:proofErr w:type="spellEnd"/>
-      <w:r>
-        <w:t>, Git, Docker et outils API.</w:t>
+        <w:t>Des extensions complémentaires seront utilisées pour améliorer l'expérience de développement : support C#, Mermaid, Git, Docker et outils API.</w:t>
       </w:r>
     </w:p>
     <w:p/>
@@ -3853,7 +3045,7 @@
 </file>
 
 <file path=word/numbering.xml><?xml version="1.0" encoding="utf-8"?>
-<w:numbering xmlns:wpc="http://schemas.microsoft.com/office/word/2010/wordprocessingCanvas" xmlns:cx="http://schemas.microsoft.com/office/drawing/2014/chartex" xmlns:cx1="http://schemas.microsoft.com/office/drawing/2015/9/8/chartex" xmlns:cx2="http://schemas.microsoft.com/office/drawing/2015/10/21/chartex" xmlns:cx3="http://schemas.microsoft.com/office/drawing/2016/5/9/chartex" xmlns:cx4="http://schemas.microsoft.com/office/drawing/2016/5/10/chartex" xmlns:cx5="http://schemas.microsoft.com/office/drawing/2016/5/11/chartex" xmlns:cx6="http://schemas.microsoft.com/office/drawing/2016/5/12/chartex" xmlns:cx7="http://schemas.microsoft.com/office/drawing/2016/5/13/chartex" xmlns:cx8="http://schemas.microsoft.com/office/drawing/2016/5/14/chartex" xmlns:mc="http://schemas.openxmlformats.org/markup-compatibility/2006" xmlns:aink="http://schemas.microsoft.com/office/drawing/2016/ink" xmlns:am3d="http://schemas.microsoft.com/office/drawing/2017/model3d" xmlns:o="urn:schemas-microsoft-com:office:office" xmlns:oel="http://schemas.microsoft.com/office/2019/extlst" xmlns:r="http://schemas.openxmlformats.org/officeDocument/2006/relationships" xmlns:m="http://schemas.openxmlformats.org/officeDocument/2006/math" xmlns:v="urn:schemas-microsoft-com:vml" xmlns:wp14="http://schemas.microsoft.com/office/word/2010/wordprocessingDrawing" xmlns:wp="http://schemas.openxmlformats.org/drawingml/2006/wordprocessingDrawing" xmlns:w10="urn:schemas-microsoft-com:office:word" xmlns:w="http://schemas.openxmlformats.org/wordprocessingml/2006/main" xmlns:w14="http://schemas.microsoft.com/office/word/2010/wordml" xmlns:w15="http://schemas.microsoft.com/office/word/2012/wordml" xmlns:w16cex="http://schemas.microsoft.com/office/word/2018/wordml/cex" xmlns:w16cid="http://schemas.microsoft.com/office/word/2016/wordml/cid" xmlns:w16="http://schemas.microsoft.com/office/word/2018/wordml" xmlns:w16du="http://schemas.microsoft.com/office/word/2023/wordml/word16du" xmlns:w16sdtdh="http://schemas.microsoft.com/office/word/2020/wordml/sdtdatahash" xmlns:w16sdtfl="http://schemas.microsoft.com/office/word/2024/wordml/sdtformatlock" xmlns:w16se="http://schemas.microsoft.com/office/word/2015/wordml/symex" xmlns:wpg="http://schemas.microsoft.com/office/word/2010/wordprocessingGroup" xmlns:wpi="http://schemas.microsoft.com/office/word/2010/wordprocessingInk" xmlns:wne="http://schemas.microsoft.com/office/word/2006/wordml" xmlns:wps="http://schemas.microsoft.com/office/word/2010/wordprocessingShape" mc:Ignorable="w14 w15 w16se w16cid w16 w16cex w16sdtdh w16sdtfl w16du wp14">
+<w:numbering xmlns:wpc="http://schemas.microsoft.com/office/word/2010/wordprocessingCanvas" xmlns:cx="http://schemas.microsoft.com/office/drawing/2014/chartex" xmlns:cx1="http://schemas.microsoft.com/office/drawing/2015/9/8/chartex" xmlns:cx2="http://schemas.microsoft.com/office/drawing/2015/10/21/chartex" xmlns:cx3="http://schemas.microsoft.com/office/drawing/2016/5/9/chartex" xmlns:cx4="http://schemas.microsoft.com/office/drawing/2016/5/10/chartex" xmlns:cx5="http://schemas.microsoft.com/office/drawing/2016/5/11/chartex" xmlns:cx6="http://schemas.microsoft.com/office/drawing/2016/5/12/chartex" xmlns:cx7="http://schemas.microsoft.com/office/drawing/2016/5/13/chartex" xmlns:cx8="http://schemas.microsoft.com/office/drawing/2016/5/14/chartex" xmlns:mc="http://schemas.openxmlformats.org/markup-compatibility/2006" xmlns:aink="http://schemas.microsoft.com/office/drawing/2016/ink" xmlns:am3d="http://schemas.microsoft.com/office/drawing/2017/model3d" xmlns:o="urn:schemas-microsoft-com:office:office" xmlns:oel="http://schemas.microsoft.com/office/2019/extlst" xmlns:r="http://schemas.openxmlformats.org/officeDocument/2006/relationships" xmlns:m="http://schemas.openxmlformats.org/officeDocument/2006/math" xmlns:v="urn:schemas-microsoft-com:vml" xmlns:wp14="http://schemas.microsoft.com/office/word/2010/wordprocessingDrawing" xmlns:wp="http://schemas.openxmlformats.org/drawingml/2006/wordprocessingDrawing" xmlns:w10="urn:schemas-microsoft-com:office:word" xmlns:w="http://schemas.openxmlformats.org/wordprocessingml/2006/main" xmlns:w14="http://schemas.microsoft.com/office/word/2010/wordml" xmlns:w15="http://schemas.microsoft.com/office/word/2012/wordml" xmlns:w16cei="http://schemas.microsoft.com/office/word/2026/wordml/cei" xmlns:w16cex="http://schemas.microsoft.com/office/word/2018/wordml/cex" xmlns:w16cid="http://schemas.microsoft.com/office/word/2016/wordml/cid" xmlns:w16="http://schemas.microsoft.com/office/word/2018/wordml" xmlns:w16du="http://schemas.microsoft.com/office/word/2023/wordml/word16du" xmlns:w16sdtdh="http://schemas.microsoft.com/office/word/2020/wordml/sdtdatahash" xmlns:w16sdtfl="http://schemas.microsoft.com/office/word/2024/wordml/sdtformatlock" xmlns:w16se="http://schemas.microsoft.com/office/word/2015/wordml/symex" xmlns:wpg="http://schemas.microsoft.com/office/word/2010/wordprocessingGroup" xmlns:wpi="http://schemas.microsoft.com/office/word/2010/wordprocessingInk" xmlns:wne="http://schemas.microsoft.com/office/word/2006/wordml" xmlns:wps="http://schemas.microsoft.com/office/word/2010/wordprocessingShape" mc:Ignorable="w14 w15 w16se w16cid w16 w16cex w16sdtdh w16sdtfl w16du wp14">
   <w:abstractNum w:abstractNumId="0" w15:restartNumberingAfterBreak="0">
     <w:nsid w:val="00695975"/>
     <w:multiLevelType w:val="multilevel"/>
@@ -9629,6 +8821,7 @@
   <w:style w:type="character" w:default="1" w:styleId="Policepardfaut">
     <w:name w:val="Default Paragraph Font"/>
     <w:uiPriority w:val="1"/>
+    <w:semiHidden/>
     <w:unhideWhenUsed/>
   </w:style>
   <w:style w:type="table" w:default="1" w:styleId="TableauNormal">

</xml_diff>